<commit_message>
First draft and design resume updated
</commit_message>
<xml_diff>
--- a/Aravinth K.docx
+++ b/Aravinth K.docx
@@ -15,7 +15,7 @@
         <mc:AlternateContent>
           <mc:Choice Requires="wps">
             <w:drawing>
-              <wp:anchor distT="45720" distB="45720" distL="114300" distR="114300" simplePos="0" relativeHeight="251634688" behindDoc="1" locked="0" layoutInCell="1" allowOverlap="1" wp14:anchorId="15A1FFE5" wp14:editId="166DC48F">
+              <wp:anchor distT="45720" distB="45720" distL="114300" distR="114300" simplePos="0" relativeHeight="251631616" behindDoc="1" locked="0" layoutInCell="1" allowOverlap="1" wp14:anchorId="15A1FFE5" wp14:editId="06A16E36">
                 <wp:simplePos x="0" y="0"/>
                 <wp:positionH relativeFrom="margin">
                   <wp:align>left</wp:align>
@@ -23,8 +23,8 @@
                 <wp:positionV relativeFrom="paragraph">
                   <wp:posOffset>-3175</wp:posOffset>
                 </wp:positionV>
-                <wp:extent cx="3295650" cy="882650"/>
-                <wp:effectExtent l="0" t="0" r="0" b="0"/>
+                <wp:extent cx="3649980" cy="882650"/>
+                <wp:effectExtent l="0" t="0" r="7620" b="0"/>
                 <wp:wrapNone/>
                 <wp:docPr id="23" name="Text Box 23"/>
                 <wp:cNvGraphicFramePr>
@@ -39,7 +39,7 @@
                       <wps:spPr bwMode="auto">
                         <a:xfrm>
                           <a:off x="0" y="0"/>
-                          <a:ext cx="3295650" cy="882650"/>
+                          <a:ext cx="3649980" cy="882650"/>
                         </a:xfrm>
                         <a:prstGeom prst="rect">
                           <a:avLst/>
@@ -108,6 +108,28 @@
                                 <w:lang w:val="en-US"/>
                               </w:rPr>
                               <w:t xml:space="preserve">  </w:t>
+                            </w:r>
+                            <w:r>
+                              <w:rPr>
+                                <w:rFonts w:ascii="Arial" w:hAnsi="Arial" w:cs="Arial"/>
+                                <w:b/>
+                                <w:bCs/>
+                                <w:color w:val="2DBCAC"/>
+                                <w:sz w:val="28"/>
+                                <w:szCs w:val="28"/>
+                              </w:rPr>
+                              <w:t>Senior</w:t>
+                            </w:r>
+                            <w:r>
+                              <w:rPr>
+                                <w:rFonts w:ascii="Arial" w:hAnsi="Arial" w:cs="Arial"/>
+                                <w:b/>
+                                <w:bCs/>
+                                <w:color w:val="2DBCAC"/>
+                                <w:sz w:val="28"/>
+                                <w:szCs w:val="28"/>
+                              </w:rPr>
+                              <w:t xml:space="preserve"> </w:t>
                             </w:r>
                             <w:r>
                               <w:rPr>
@@ -145,7 +167,7 @@
                 <v:stroke joinstyle="miter"/>
                 <v:path gradientshapeok="t" o:connecttype="rect"/>
               </v:shapetype>
-              <v:shape id="Text Box 23" o:spid="_x0000_s1026" type="#_x0000_t202" style="position:absolute;margin-left:0;margin-top:-.25pt;width:259.5pt;height:69.5pt;z-index:-251681792;visibility:visible;mso-wrap-style:square;mso-width-percent:0;mso-height-percent:0;mso-wrap-distance-left:9pt;mso-wrap-distance-top:3.6pt;mso-wrap-distance-right:9pt;mso-wrap-distance-bottom:3.6pt;mso-position-horizontal:left;mso-position-horizontal-relative:margin;mso-position-vertical:absolute;mso-position-vertical-relative:text;mso-width-percent:0;mso-height-percent:0;mso-width-relative:margin;mso-height-relative:margin;v-text-anchor:top" o:gfxdata="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" stroked="f">
+              <v:shape id="Text Box 23" o:spid="_x0000_s1026" type="#_x0000_t202" style="position:absolute;margin-left:0;margin-top:-.25pt;width:287.4pt;height:69.5pt;z-index:-251684864;visibility:visible;mso-wrap-style:square;mso-width-percent:0;mso-height-percent:0;mso-wrap-distance-left:9pt;mso-wrap-distance-top:3.6pt;mso-wrap-distance-right:9pt;mso-wrap-distance-bottom:3.6pt;mso-position-horizontal:left;mso-position-horizontal-relative:margin;mso-position-vertical:absolute;mso-position-vertical-relative:text;mso-width-percent:0;mso-height-percent:0;mso-width-relative:margin;mso-height-relative:margin;v-text-anchor:top" o:gfxdata="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" stroked="f">
                 <v:textbox>
                   <w:txbxContent>
                     <w:p>
@@ -200,6 +222,28 @@
                           <w:lang w:val="en-US"/>
                         </w:rPr>
                         <w:t xml:space="preserve">  </w:t>
+                      </w:r>
+                      <w:r>
+                        <w:rPr>
+                          <w:rFonts w:ascii="Arial" w:hAnsi="Arial" w:cs="Arial"/>
+                          <w:b/>
+                          <w:bCs/>
+                          <w:color w:val="2DBCAC"/>
+                          <w:sz w:val="28"/>
+                          <w:szCs w:val="28"/>
+                        </w:rPr>
+                        <w:t>Senior</w:t>
+                      </w:r>
+                      <w:r>
+                        <w:rPr>
+                          <w:rFonts w:ascii="Arial" w:hAnsi="Arial" w:cs="Arial"/>
+                          <w:b/>
+                          <w:bCs/>
+                          <w:color w:val="2DBCAC"/>
+                          <w:sz w:val="28"/>
+                          <w:szCs w:val="28"/>
+                        </w:rPr>
+                        <w:t xml:space="preserve"> </w:t>
                       </w:r>
                       <w:r>
                         <w:rPr>
@@ -238,16 +282,16 @@
         <mc:AlternateContent>
           <mc:Choice Requires="wps">
             <w:drawing>
-              <wp:anchor distT="45720" distB="45720" distL="114300" distR="114300" simplePos="0" relativeHeight="251649024" behindDoc="1" locked="0" layoutInCell="1" allowOverlap="1" wp14:anchorId="699C272A" wp14:editId="64DFA028">
+              <wp:anchor distT="45720" distB="45720" distL="114300" distR="114300" simplePos="0" relativeHeight="251645952" behindDoc="1" locked="0" layoutInCell="1" allowOverlap="1" wp14:anchorId="699C272A" wp14:editId="4E67E9AA">
                 <wp:simplePos x="0" y="0"/>
                 <wp:positionH relativeFrom="margin">
                   <wp:align>right</wp:align>
                 </wp:positionH>
                 <wp:positionV relativeFrom="paragraph">
-                  <wp:posOffset>59055</wp:posOffset>
+                  <wp:posOffset>24765</wp:posOffset>
                 </wp:positionV>
-                <wp:extent cx="6847027" cy="617855"/>
-                <wp:effectExtent l="0" t="0" r="0" b="0"/>
+                <wp:extent cx="6847027" cy="815340"/>
+                <wp:effectExtent l="0" t="0" r="0" b="3810"/>
                 <wp:wrapNone/>
                 <wp:docPr id="934874461" name="Text Box 934874461"/>
                 <wp:cNvGraphicFramePr>
@@ -262,7 +306,7 @@
                       <wps:spPr bwMode="auto">
                         <a:xfrm>
                           <a:off x="0" y="0"/>
-                          <a:ext cx="6847027" cy="617855"/>
+                          <a:ext cx="6847027" cy="815340"/>
                         </a:xfrm>
                         <a:prstGeom prst="rect">
                           <a:avLst/>
@@ -281,23 +325,33 @@
                         <w:txbxContent>
                           <w:p>
                             <w:pPr>
-                              <w:pStyle w:val="ListParagraph"/>
+                              <w:pStyle w:val="NormalWeb"/>
                               <w:numPr>
                                 <w:ilvl w:val="0"/>
                                 <w:numId w:val="3"/>
                               </w:numPr>
-                              <w:spacing w:after="0"/>
-                              <w:jc w:val="both"/>
-                              <w:rPr>
-                                <w:rFonts w:ascii="Arial" w:hAnsi="Arial" w:cs="Arial"/>
+                              <w:rPr>
+                                <w:rFonts w:ascii="Arial" w:hAnsi="Arial" w:cs="Arial"/>
+                                <w:sz w:val="22"/>
+                                <w:szCs w:val="22"/>
                               </w:rPr>
                             </w:pPr>
                             <w:r>
                               <w:rPr>
                                 <w:rFonts w:ascii="Arial" w:hAnsi="Arial" w:cs="Arial"/>
-                                <w:w w:val="110"/>
-                              </w:rPr>
-                              <w:t>5+ years of experience in embedded systems software design &amp; development. Proficiency in application coding, software optimization, validation and good knowledge in problem solving, root cause analysis, logical thinking.</w:t>
+                                <w:sz w:val="22"/>
+                                <w:szCs w:val="22"/>
+                                <w:lang w:val="en-IN"/>
+                              </w:rPr>
+                              <w:t xml:space="preserve">Senior </w:t>
+                            </w:r>
+                            <w:r>
+                              <w:rPr>
+                                <w:rFonts w:ascii="Arial" w:hAnsi="Arial" w:cs="Arial"/>
+                                <w:sz w:val="22"/>
+                                <w:szCs w:val="22"/>
+                              </w:rPr>
+                              <w:t>Embedded Software Engineer with 6+ years of experience in embedded systems design, development, and validation. Proficient in C/C++, RTOS-based firmware development, software optimization, debugging, and root cause analysis, with strong problem-solving and analytical skills throughout the product development lifecycle.</w:t>
                             </w:r>
                           </w:p>
                         </w:txbxContent>
@@ -319,28 +373,38 @@
           </mc:Choice>
           <mc:Fallback>
             <w:pict>
-              <v:shape w14:anchorId="699C272A" id="Text Box 934874461" o:spid="_x0000_s1027" type="#_x0000_t202" style="position:absolute;margin-left:487.95pt;margin-top:4.65pt;width:539.15pt;height:48.65pt;z-index:-251667456;visibility:visible;mso-wrap-style:square;mso-width-percent:0;mso-height-percent:0;mso-wrap-distance-left:9pt;mso-wrap-distance-top:3.6pt;mso-wrap-distance-right:9pt;mso-wrap-distance-bottom:3.6pt;mso-position-horizontal:right;mso-position-horizontal-relative:margin;mso-position-vertical:absolute;mso-position-vertical-relative:text;mso-width-percent:0;mso-height-percent:0;mso-width-relative:margin;mso-height-relative:margin;v-text-anchor:top" o:gfxdata="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" stroked="f">
+              <v:shape w14:anchorId="699C272A" id="Text Box 934874461" o:spid="_x0000_s1027" type="#_x0000_t202" style="position:absolute;margin-left:487.95pt;margin-top:1.95pt;width:539.15pt;height:64.2pt;z-index:-251670528;visibility:visible;mso-wrap-style:square;mso-width-percent:0;mso-height-percent:0;mso-wrap-distance-left:9pt;mso-wrap-distance-top:3.6pt;mso-wrap-distance-right:9pt;mso-wrap-distance-bottom:3.6pt;mso-position-horizontal:right;mso-position-horizontal-relative:margin;mso-position-vertical:absolute;mso-position-vertical-relative:text;mso-width-percent:0;mso-height-percent:0;mso-width-relative:margin;mso-height-relative:margin;v-text-anchor:top" o:gfxdata="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" stroked="f">
                 <v:textbox>
                   <w:txbxContent>
                     <w:p>
                       <w:pPr>
-                        <w:pStyle w:val="ListParagraph"/>
+                        <w:pStyle w:val="NormalWeb"/>
                         <w:numPr>
                           <w:ilvl w:val="0"/>
                           <w:numId w:val="3"/>
                         </w:numPr>
-                        <w:spacing w:after="0"/>
-                        <w:jc w:val="both"/>
-                        <w:rPr>
-                          <w:rFonts w:ascii="Arial" w:hAnsi="Arial" w:cs="Arial"/>
+                        <w:rPr>
+                          <w:rFonts w:ascii="Arial" w:hAnsi="Arial" w:cs="Arial"/>
+                          <w:sz w:val="22"/>
+                          <w:szCs w:val="22"/>
                         </w:rPr>
                       </w:pPr>
                       <w:r>
                         <w:rPr>
                           <w:rFonts w:ascii="Arial" w:hAnsi="Arial" w:cs="Arial"/>
-                          <w:w w:val="110"/>
-                        </w:rPr>
-                        <w:t>5+ years of experience in embedded systems software design &amp; development. Proficiency in application coding, software optimization, validation and good knowledge in problem solving, root cause analysis, logical thinking.</w:t>
+                          <w:sz w:val="22"/>
+                          <w:szCs w:val="22"/>
+                          <w:lang w:val="en-IN"/>
+                        </w:rPr>
+                        <w:t xml:space="preserve">Senior </w:t>
+                      </w:r>
+                      <w:r>
+                        <w:rPr>
+                          <w:rFonts w:ascii="Arial" w:hAnsi="Arial" w:cs="Arial"/>
+                          <w:sz w:val="22"/>
+                          <w:szCs w:val="22"/>
+                        </w:rPr>
+                        <w:t>Embedded Software Engineer with 6+ years of experience in embedded systems design, development, and validation. Proficient in C/C++, RTOS-based firmware development, software optimization, debugging, and root cause analysis, with strong problem-solving and analytical skills throughout the product development lifecycle.</w:t>
                       </w:r>
                     </w:p>
                   </w:txbxContent>
@@ -353,6 +417,7 @@
       </w:r>
     </w:p>
     <w:p/>
+    <w:p/>
     <w:p>
       <w:r>
         <w:rPr>
@@ -363,13 +428,13 @@
         <mc:AlternateContent>
           <mc:Choice Requires="wps">
             <w:drawing>
-              <wp:anchor distT="0" distB="0" distL="114300" distR="114300" simplePos="0" relativeHeight="251646976" behindDoc="1" locked="0" layoutInCell="1" allowOverlap="1" wp14:anchorId="31455A8F" wp14:editId="3C780EE1">
+              <wp:anchor distT="0" distB="0" distL="114300" distR="114300" simplePos="0" relativeHeight="251643904" behindDoc="1" locked="0" layoutInCell="1" allowOverlap="1" wp14:anchorId="31455A8F" wp14:editId="246250F5">
                 <wp:simplePos x="0" y="0"/>
                 <wp:positionH relativeFrom="margin">
                   <wp:align>right</wp:align>
                 </wp:positionH>
                 <wp:positionV relativeFrom="paragraph">
-                  <wp:posOffset>222250</wp:posOffset>
+                  <wp:posOffset>5080</wp:posOffset>
                 </wp:positionV>
                 <wp:extent cx="6838950" cy="6350"/>
                 <wp:effectExtent l="0" t="0" r="19050" b="31750"/>
@@ -418,7 +483,7 @@
           </mc:Choice>
           <mc:Fallback>
             <w:pict>
-              <v:line w14:anchorId="559E31AC" id="Straight Connector 1615218264" o:spid="_x0000_s1026" style="position:absolute;flip:y;z-index:-251669504;visibility:visible;mso-wrap-style:square;mso-width-percent:0;mso-height-percent:0;mso-wrap-distance-left:9pt;mso-wrap-distance-top:0;mso-wrap-distance-right:9pt;mso-wrap-distance-bottom:0;mso-position-horizontal:right;mso-position-horizontal-relative:margin;mso-position-vertical:absolute;mso-position-vertical-relative:text;mso-width-percent:0;mso-height-percent:0;mso-width-relative:margin;mso-height-relative:margin" from="487.3pt,17.5pt" to="1025.8pt,18pt" o:gfxdata="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" strokecolor="#156082 [3204]" strokeweight="1pt">
+              <v:line w14:anchorId="53EF0852" id="Straight Connector 1615218264" o:spid="_x0000_s1026" style="position:absolute;flip:y;z-index:-251672576;visibility:visible;mso-wrap-style:square;mso-width-percent:0;mso-height-percent:0;mso-wrap-distance-left:9pt;mso-wrap-distance-top:0;mso-wrap-distance-right:9pt;mso-wrap-distance-bottom:0;mso-position-horizontal:right;mso-position-horizontal-relative:margin;mso-position-vertical:absolute;mso-position-vertical-relative:text;mso-width-percent:0;mso-height-percent:0;mso-width-relative:margin;mso-height-relative:margin" from="487.3pt,.4pt" to="1025.8pt,.9pt" o:gfxdata="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" strokecolor="#156082 [3204]" strokeweight="1pt">
                 <v:stroke joinstyle="miter"/>
                 <w10:wrap anchorx="margin"/>
               </v:line>
@@ -426,8 +491,6 @@
           </mc:Fallback>
         </mc:AlternateContent>
       </w:r>
-    </w:p>
-    <w:p>
       <w:r>
         <w:rPr>
           <w:noProof/>
@@ -436,7 +499,7 @@
         <mc:AlternateContent>
           <mc:Choice Requires="wps">
             <w:drawing>
-              <wp:anchor distT="0" distB="0" distL="114300" distR="114300" simplePos="0" relativeHeight="251661312" behindDoc="1" locked="0" layoutInCell="1" allowOverlap="1" wp14:anchorId="128ED6E9" wp14:editId="7210173D">
+              <wp:anchor distT="0" distB="0" distL="114300" distR="114300" simplePos="0" relativeHeight="251658240" behindDoc="1" locked="0" layoutInCell="1" allowOverlap="1" wp14:anchorId="128ED6E9" wp14:editId="374C3080">
                 <wp:simplePos x="0" y="0"/>
                 <wp:positionH relativeFrom="column">
                   <wp:align>right</wp:align>
@@ -705,7 +768,7 @@
           </mc:Choice>
           <mc:Fallback>
             <w:pict>
-              <v:shape w14:anchorId="128ED6E9" id="Text Box 2" o:spid="_x0000_s1028" type="#_x0000_t202" style="position:absolute;margin-left:200.3pt;margin-top:12.05pt;width:251.5pt;height:182pt;z-index:-251655168;visibility:visible;mso-wrap-style:square;mso-width-percent:0;mso-height-percent:0;mso-wrap-distance-left:9pt;mso-wrap-distance-top:0;mso-wrap-distance-right:9pt;mso-wrap-distance-bottom:0;mso-position-horizontal:right;mso-position-horizontal-relative:text;mso-position-vertical:absolute;mso-position-vertical-relative:text;mso-width-percent:0;mso-height-percent:0;mso-width-relative:margin;mso-height-relative:margin;v-text-anchor:top" o:gfxdata="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" filled="f" stroked="f" strokeweight="1.5pt">
+              <v:shape w14:anchorId="128ED6E9" id="Text Box 2" o:spid="_x0000_s1028" type="#_x0000_t202" style="position:absolute;margin-left:200.3pt;margin-top:12.05pt;width:251.5pt;height:182pt;z-index:-251658240;visibility:visible;mso-wrap-style:square;mso-width-percent:0;mso-height-percent:0;mso-wrap-distance-left:9pt;mso-wrap-distance-top:0;mso-wrap-distance-right:9pt;mso-wrap-distance-bottom:0;mso-position-horizontal:right;mso-position-horizontal-relative:text;mso-position-vertical:absolute;mso-position-vertical-relative:text;mso-width-percent:0;mso-height-percent:0;mso-width-relative:margin;mso-height-relative:margin;v-text-anchor:top" o:gfxdata="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" filled="f" stroked="f" strokeweight="1.5pt">
                 <v:textbox>
                   <w:txbxContent>
                     <w:p>
@@ -919,7 +982,7 @@
           <w14:ligatures w14:val="standardContextual"/>
         </w:rPr>
         <w:drawing>
-          <wp:anchor distT="0" distB="0" distL="114300" distR="114300" simplePos="0" relativeHeight="251662336" behindDoc="1" locked="0" layoutInCell="1" allowOverlap="1" wp14:anchorId="22B744AC" wp14:editId="6E5870E6">
+          <wp:anchor distT="0" distB="0" distL="114300" distR="114300" simplePos="0" relativeHeight="251659264" behindDoc="1" locked="0" layoutInCell="1" allowOverlap="1" wp14:anchorId="22B744AC" wp14:editId="00ED617D">
             <wp:simplePos x="0" y="0"/>
             <wp:positionH relativeFrom="column">
               <wp:posOffset>44450</wp:posOffset>
@@ -996,7 +1059,7 @@
         <mc:AlternateContent>
           <mc:Choice Requires="wps">
             <w:drawing>
-              <wp:anchor distT="0" distB="0" distL="114300" distR="114300" simplePos="0" relativeHeight="251664384" behindDoc="1" locked="0" layoutInCell="1" allowOverlap="1" wp14:anchorId="542321D7" wp14:editId="51F01D91">
+              <wp:anchor distT="0" distB="0" distL="114300" distR="114300" simplePos="0" relativeHeight="251661312" behindDoc="1" locked="0" layoutInCell="1" allowOverlap="1" wp14:anchorId="542321D7" wp14:editId="2DC1BAB9">
                 <wp:simplePos x="0" y="0"/>
                 <wp:positionH relativeFrom="column">
                   <wp:align>right</wp:align>
@@ -1208,7 +1271,7 @@
           </mc:Choice>
           <mc:Fallback>
             <w:pict>
-              <v:shape w14:anchorId="542321D7" id="_x0000_s1029" type="#_x0000_t202" style="position:absolute;margin-left:200.8pt;margin-top:18.15pt;width:252pt;height:105pt;z-index:-251652096;visibility:visible;mso-wrap-style:square;mso-width-percent:0;mso-height-percent:0;mso-wrap-distance-left:9pt;mso-wrap-distance-top:0;mso-wrap-distance-right:9pt;mso-wrap-distance-bottom:0;mso-position-horizontal:right;mso-position-horizontal-relative:text;mso-position-vertical:absolute;mso-position-vertical-relative:text;mso-width-percent:0;mso-height-percent:0;mso-width-relative:margin;mso-height-relative:margin;v-text-anchor:top" o:gfxdata="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" filled="f" stroked="f" strokeweight="1.5pt">
+              <v:shape w14:anchorId="542321D7" id="_x0000_s1029" type="#_x0000_t202" style="position:absolute;margin-left:200.8pt;margin-top:18.15pt;width:252pt;height:105pt;z-index:-251655168;visibility:visible;mso-wrap-style:square;mso-width-percent:0;mso-height-percent:0;mso-wrap-distance-left:9pt;mso-wrap-distance-top:0;mso-wrap-distance-right:9pt;mso-wrap-distance-bottom:0;mso-position-horizontal:right;mso-position-horizontal-relative:text;mso-position-vertical:absolute;mso-position-vertical-relative:text;mso-width-percent:0;mso-height-percent:0;mso-width-relative:margin;mso-height-relative:margin;v-text-anchor:top" o:gfxdata="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" filled="f" stroked="f" strokeweight="1.5pt">
                 <v:textbox>
                   <w:txbxContent>
                     <w:p>
@@ -1375,7 +1438,7 @@
         <mc:AlternateContent>
           <mc:Choice Requires="wps">
             <w:drawing>
-              <wp:anchor distT="45720" distB="45720" distL="114300" distR="114300" simplePos="0" relativeHeight="251666432" behindDoc="1" locked="0" layoutInCell="1" allowOverlap="1" wp14:anchorId="09416EAA" wp14:editId="03AB20D1">
+              <wp:anchor distT="45720" distB="45720" distL="114300" distR="114300" simplePos="0" relativeHeight="251663360" behindDoc="1" locked="0" layoutInCell="1" allowOverlap="1" wp14:anchorId="09416EAA" wp14:editId="7C251B87">
                 <wp:simplePos x="0" y="0"/>
                 <wp:positionH relativeFrom="column">
                   <wp:align>right</wp:align>
@@ -1572,7 +1635,7 @@
           </mc:Choice>
           <mc:Fallback>
             <w:pict>
-              <v:shape w14:anchorId="09416EAA" id="_x0000_s1030" type="#_x0000_t202" style="position:absolute;margin-left:200.8pt;margin-top:.6pt;width:252pt;height:108.5pt;z-index:-251650048;visibility:visible;mso-wrap-style:square;mso-width-percent:0;mso-height-percent:0;mso-wrap-distance-left:9pt;mso-wrap-distance-top:3.6pt;mso-wrap-distance-right:9pt;mso-wrap-distance-bottom:3.6pt;mso-position-horizontal:right;mso-position-horizontal-relative:text;mso-position-vertical:absolute;mso-position-vertical-relative:text;mso-width-percent:0;mso-height-percent:0;mso-width-relative:margin;mso-height-relative:margin;v-text-anchor:top" o:gfxdata="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" filled="f" stroked="f" strokeweight="1.5pt">
+              <v:shape w14:anchorId="09416EAA" id="_x0000_s1030" type="#_x0000_t202" style="position:absolute;margin-left:200.8pt;margin-top:.6pt;width:252pt;height:108.5pt;z-index:-251653120;visibility:visible;mso-wrap-style:square;mso-width-percent:0;mso-height-percent:0;mso-wrap-distance-left:9pt;mso-wrap-distance-top:3.6pt;mso-wrap-distance-right:9pt;mso-wrap-distance-bottom:3.6pt;mso-position-horizontal:right;mso-position-horizontal-relative:text;mso-position-vertical:absolute;mso-position-vertical-relative:text;mso-width-percent:0;mso-height-percent:0;mso-width-relative:margin;mso-height-relative:margin;v-text-anchor:top" o:gfxdata="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" filled="f" stroked="f" strokeweight="1.5pt">
                 <v:textbox>
                   <w:txbxContent>
                     <w:p>
@@ -1725,7 +1788,7 @@
         <mc:AlternateContent>
           <mc:Choice Requires="wpg">
             <w:drawing>
-              <wp:anchor distT="0" distB="0" distL="114300" distR="114300" simplePos="0" relativeHeight="251668480" behindDoc="1" locked="0" layoutInCell="1" allowOverlap="1" wp14:anchorId="55B6AB39" wp14:editId="57169CEF">
+              <wp:anchor distT="0" distB="0" distL="114300" distR="114300" simplePos="0" relativeHeight="251665408" behindDoc="1" locked="0" layoutInCell="1" allowOverlap="1" wp14:anchorId="55B6AB39" wp14:editId="369E0AF5">
                 <wp:simplePos x="0" y="0"/>
                 <wp:positionH relativeFrom="margin">
                   <wp:align>left</wp:align>
@@ -1968,7 +2031,7 @@
           </mc:Choice>
           <mc:Fallback>
             <w:pict>
-              <v:group w14:anchorId="55B6AB39" id="Group 26" o:spid="_x0000_s1031" style="position:absolute;margin-left:0;margin-top:.5pt;width:263.55pt;height:119.2pt;z-index:-251648000;mso-position-horizontal:left;mso-position-horizontal-relative:margin" coordsize="33472,15139" o:gfxdata="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">
+              <v:group w14:anchorId="55B6AB39" id="Group 26" o:spid="_x0000_s1031" style="position:absolute;margin-left:0;margin-top:.5pt;width:263.55pt;height:119.2pt;z-index:-251651072;mso-position-horizontal:left;mso-position-horizontal-relative:margin" coordsize="33472,15139" o:gfxdata="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">
                 <v:shape id="_x0000_s1032" type="#_x0000_t202" style="position:absolute;width:33472;height:15139;visibility:visible;mso-wrap-style:square;v-text-anchor:top" o:gfxdata="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" fillcolor="white [3201]" stroked="f" strokeweight="1.5pt">
                   <v:textbox>
                     <w:txbxContent>
@@ -2523,7 +2586,7 @@
           </mc:Choice>
           <mc:Fallback>
             <w:pict>
-              <v:group w14:anchorId="7C75EA68" id="Group 88" o:spid="_x0000_s1026" style="position:absolute;margin-left:-38.85pt;margin-top:8.35pt;width:12.35pt;height:48.55pt;z-index:-251602944;mso-position-horizontal:right;mso-position-horizontal-relative:margin;mso-width-relative:margin;mso-height-relative:margin" coordsize="1286,5847" o:gfxdata="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">
+              <v:group w14:anchorId="73205876" id="Group 88" o:spid="_x0000_s1026" style="position:absolute;margin-left:-38.85pt;margin-top:8.35pt;width:12.35pt;height:48.55pt;z-index:-251602944;mso-position-horizontal:right;mso-position-horizontal-relative:margin;mso-width-relative:margin;mso-height-relative:margin" coordsize="1286,5847" o:gfxdata="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">
                 <v:shape id="image1.png" o:spid="_x0000_s1027" type="#_x0000_t75" style="position:absolute;width:1238;height:971;visibility:visible;mso-wrap-style:square" o:gfxdata="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">
                   <v:imagedata r:id="rId13" o:title=""/>
                 </v:shape>
@@ -2554,7 +2617,7 @@
         <mc:AlternateContent>
           <mc:Choice Requires="wpg">
             <w:drawing>
-              <wp:anchor distT="0" distB="0" distL="114300" distR="114300" simplePos="0" relativeHeight="251674624" behindDoc="1" locked="0" layoutInCell="1" allowOverlap="1" wp14:anchorId="3BE247C1" wp14:editId="4B0D6A82">
+              <wp:anchor distT="0" distB="0" distL="114300" distR="114300" simplePos="0" relativeHeight="251671552" behindDoc="1" locked="0" layoutInCell="1" allowOverlap="1" wp14:anchorId="3BE247C1" wp14:editId="5D1D591B">
                 <wp:simplePos x="0" y="0"/>
                 <wp:positionH relativeFrom="margin">
                   <wp:align>right</wp:align>
@@ -2734,26 +2797,48 @@
                                   <w:rFonts w:ascii="Arial" w:hAnsi="Arial" w:cs="Arial"/>
                                   <w:w w:val="105"/>
                                 </w:rPr>
-                                <w:t xml:space="preserve">Serial terminal, GDB, XDS110 Debug Probe (TI), logic </w:t>
+                                <w:t xml:space="preserve">Serial terminal, GDB, XDS110 Debug Probe (TI), logic analysers, Oscilloscope, JTAG </w:t>
+                              </w:r>
+                            </w:p>
+                            <w:p>
+                              <w:pPr>
+                                <w:spacing w:before="179" w:line="0" w:lineRule="atLeast"/>
+                                <w:ind w:right="128"/>
+                                <w:rPr>
+                                  <w:rFonts w:ascii="Arial" w:hAnsi="Arial" w:cs="Arial"/>
+                                  <w:b/>
+                                  <w:bCs/>
+                                  <w:w w:val="105"/>
+                                  <w:sz w:val="24"/>
+                                  <w:szCs w:val="24"/>
+                                </w:rPr>
+                              </w:pPr>
+                              <w:r>
+                                <w:rPr>
+                                  <w:rFonts w:ascii="Arial" w:hAnsi="Arial" w:cs="Arial"/>
+                                  <w:b/>
+                                  <w:bCs/>
+                                  <w:w w:val="105"/>
+                                  <w:sz w:val="24"/>
+                                  <w:szCs w:val="24"/>
+                                </w:rPr>
+                                <w:t xml:space="preserve">Version Control: </w:t>
                               </w:r>
                               <w:r>
                                 <w:rPr>
                                   <w:rFonts w:ascii="Arial" w:hAnsi="Arial" w:cs="Arial"/>
                                   <w:w w:val="105"/>
                                 </w:rPr>
-                                <w:t>analysers</w:t>
+                                <w:t>Git/Gerrit</w:t>
                               </w:r>
                               <w:r>
                                 <w:rPr>
                                   <w:rFonts w:ascii="Arial" w:hAnsi="Arial" w:cs="Arial"/>
+                                  <w:b/>
+                                  <w:bCs/>
                                   <w:w w:val="105"/>
-                                </w:rPr>
-                                <w:t>, Oscilloscope, JTAG</w:t>
-                              </w:r>
-                              <w:r>
-                                <w:rPr>
-                                  <w:rFonts w:ascii="Arial" w:hAnsi="Arial" w:cs="Arial"/>
-                                  <w:w w:val="105"/>
+                                  <w:sz w:val="24"/>
+                                  <w:szCs w:val="24"/>
                                 </w:rPr>
                                 <w:t xml:space="preserve"> </w:t>
                               </w:r>
@@ -2764,49 +2849,6 @@
                                 <w:ind w:right="128"/>
                                 <w:rPr>
                                   <w:rFonts w:ascii="Arial" w:hAnsi="Arial" w:cs="Arial"/>
-                                  <w:b/>
-                                  <w:bCs/>
-                                  <w:w w:val="105"/>
-                                  <w:sz w:val="24"/>
-                                  <w:szCs w:val="24"/>
-                                </w:rPr>
-                              </w:pPr>
-                              <w:r>
-                                <w:rPr>
-                                  <w:rFonts w:ascii="Arial" w:hAnsi="Arial" w:cs="Arial"/>
-                                  <w:b/>
-                                  <w:bCs/>
-                                  <w:w w:val="105"/>
-                                  <w:sz w:val="24"/>
-                                  <w:szCs w:val="24"/>
-                                </w:rPr>
-                                <w:t xml:space="preserve">Version Control: </w:t>
-                              </w:r>
-                              <w:r>
-                                <w:rPr>
-                                  <w:rFonts w:ascii="Arial" w:hAnsi="Arial" w:cs="Arial"/>
-                                  <w:w w:val="105"/>
-                                </w:rPr>
-                                <w:t>Git/Gerrit</w:t>
-                              </w:r>
-                              <w:r>
-                                <w:rPr>
-                                  <w:rFonts w:ascii="Arial" w:hAnsi="Arial" w:cs="Arial"/>
-                                  <w:b/>
-                                  <w:bCs/>
-                                  <w:w w:val="105"/>
-                                  <w:sz w:val="24"/>
-                                  <w:szCs w:val="24"/>
-                                </w:rPr>
-                                <w:t xml:space="preserve"> </w:t>
-                              </w:r>
-                            </w:p>
-                            <w:p>
-                              <w:pPr>
-                                <w:spacing w:before="179" w:line="0" w:lineRule="atLeast"/>
-                                <w:ind w:right="128"/>
-                                <w:rPr>
-                                  <w:rFonts w:ascii="Arial" w:hAnsi="Arial" w:cs="Arial"/>
                                   <w:w w:val="105"/>
                                 </w:rPr>
                               </w:pPr>
@@ -2896,18 +2938,7 @@
                                   <w:sz w:val="24"/>
                                   <w:szCs w:val="24"/>
                                 </w:rPr>
-                                <w:t>Programming Languages</w:t>
-                              </w:r>
-                              <w:r>
-                                <w:rPr>
-                                  <w:rFonts w:ascii="Arial" w:hAnsi="Arial" w:cs="Arial"/>
-                                  <w:b/>
-                                  <w:bCs/>
-                                  <w:w w:val="105"/>
-                                  <w:sz w:val="24"/>
-                                  <w:szCs w:val="24"/>
-                                </w:rPr>
-                                <w:t>:</w:t>
+                                <w:t>Programming Languages:</w:t>
                               </w:r>
                               <w:r>
                                 <w:t xml:space="preserve"> </w:t>
@@ -2916,19 +2947,7 @@
                                 <w:rPr>
                                   <w:rFonts w:ascii="Arial" w:hAnsi="Arial" w:cs="Arial"/>
                                 </w:rPr>
-                                <w:t xml:space="preserve">Embedded C, </w:t>
-                              </w:r>
-                              <w:r>
-                                <w:rPr>
-                                  <w:rFonts w:ascii="Arial" w:hAnsi="Arial" w:cs="Arial"/>
-                                </w:rPr>
-                                <w:t>C++,</w:t>
-                              </w:r>
-                              <w:r>
-                                <w:rPr>
-                                  <w:rFonts w:ascii="Arial" w:hAnsi="Arial" w:cs="Arial"/>
-                                </w:rPr>
-                                <w:t xml:space="preserve"> Shell Script</w:t>
+                                <w:t>Embedded C, C++, Shell Script</w:t>
                               </w:r>
                             </w:p>
                             <w:p>
@@ -2990,18 +3009,7 @@
                                   <w:sz w:val="24"/>
                                   <w:szCs w:val="24"/>
                                 </w:rPr>
-                                <w:t>Protocols &amp; IoT Edge Devices</w:t>
-                              </w:r>
-                              <w:r>
-                                <w:rPr>
-                                  <w:rFonts w:ascii="Arial" w:hAnsi="Arial" w:cs="Arial"/>
-                                  <w:b/>
-                                  <w:bCs/>
-                                  <w:w w:val="105"/>
-                                  <w:sz w:val="24"/>
-                                  <w:szCs w:val="24"/>
-                                </w:rPr>
-                                <w:t>:</w:t>
+                                <w:t>Protocols &amp; IoT Edge Devices:</w:t>
                               </w:r>
                               <w:r>
                                 <w:t xml:space="preserve"> </w:t>
@@ -3197,7 +3205,7 @@
           </mc:Choice>
           <mc:Fallback>
             <w:pict>
-              <v:group w14:anchorId="3BE247C1" id="Group 10" o:spid="_x0000_s1035" style="position:absolute;margin-left:200.9pt;margin-top:5.5pt;width:252.1pt;height:460pt;z-index:-251641856;mso-position-horizontal:right;mso-position-horizontal-relative:margin" coordsize="32016,58420" o:gfxdata="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">
+              <v:group w14:anchorId="3BE247C1" id="Group 10" o:spid="_x0000_s1035" style="position:absolute;margin-left:200.9pt;margin-top:5.5pt;width:252.1pt;height:460pt;z-index:-251644928;mso-position-horizontal:right;mso-position-horizontal-relative:margin" coordsize="32016,58420" o:gfxdata="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">
                 <v:shape id="_x0000_s1036" type="#_x0000_t202" style="position:absolute;width:32016;height:58420;visibility:visible;mso-wrap-style:square;v-text-anchor:top" o:gfxdata="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" fillcolor="white [3201]" stroked="f" strokeweight="1.5pt">
                   <v:textbox>
                     <w:txbxContent>
@@ -3321,26 +3329,48 @@
                             <w:rFonts w:ascii="Arial" w:hAnsi="Arial" w:cs="Arial"/>
                             <w:w w:val="105"/>
                           </w:rPr>
-                          <w:t xml:space="preserve">Serial terminal, GDB, XDS110 Debug Probe (TI), logic </w:t>
+                          <w:t xml:space="preserve">Serial terminal, GDB, XDS110 Debug Probe (TI), logic analysers, Oscilloscope, JTAG </w:t>
+                        </w:r>
+                      </w:p>
+                      <w:p>
+                        <w:pPr>
+                          <w:spacing w:before="179" w:line="0" w:lineRule="atLeast"/>
+                          <w:ind w:right="128"/>
+                          <w:rPr>
+                            <w:rFonts w:ascii="Arial" w:hAnsi="Arial" w:cs="Arial"/>
+                            <w:b/>
+                            <w:bCs/>
+                            <w:w w:val="105"/>
+                            <w:sz w:val="24"/>
+                            <w:szCs w:val="24"/>
+                          </w:rPr>
+                        </w:pPr>
+                        <w:r>
+                          <w:rPr>
+                            <w:rFonts w:ascii="Arial" w:hAnsi="Arial" w:cs="Arial"/>
+                            <w:b/>
+                            <w:bCs/>
+                            <w:w w:val="105"/>
+                            <w:sz w:val="24"/>
+                            <w:szCs w:val="24"/>
+                          </w:rPr>
+                          <w:t xml:space="preserve">Version Control: </w:t>
                         </w:r>
                         <w:r>
                           <w:rPr>
                             <w:rFonts w:ascii="Arial" w:hAnsi="Arial" w:cs="Arial"/>
                             <w:w w:val="105"/>
                           </w:rPr>
-                          <w:t>analysers</w:t>
+                          <w:t>Git/Gerrit</w:t>
                         </w:r>
                         <w:r>
                           <w:rPr>
                             <w:rFonts w:ascii="Arial" w:hAnsi="Arial" w:cs="Arial"/>
+                            <w:b/>
+                            <w:bCs/>
                             <w:w w:val="105"/>
-                          </w:rPr>
-                          <w:t>, Oscilloscope, JTAG</w:t>
-                        </w:r>
-                        <w:r>
-                          <w:rPr>
-                            <w:rFonts w:ascii="Arial" w:hAnsi="Arial" w:cs="Arial"/>
-                            <w:w w:val="105"/>
+                            <w:sz w:val="24"/>
+                            <w:szCs w:val="24"/>
                           </w:rPr>
                           <w:t xml:space="preserve"> </w:t>
                         </w:r>
@@ -3351,49 +3381,6 @@
                           <w:ind w:right="128"/>
                           <w:rPr>
                             <w:rFonts w:ascii="Arial" w:hAnsi="Arial" w:cs="Arial"/>
-                            <w:b/>
-                            <w:bCs/>
-                            <w:w w:val="105"/>
-                            <w:sz w:val="24"/>
-                            <w:szCs w:val="24"/>
-                          </w:rPr>
-                        </w:pPr>
-                        <w:r>
-                          <w:rPr>
-                            <w:rFonts w:ascii="Arial" w:hAnsi="Arial" w:cs="Arial"/>
-                            <w:b/>
-                            <w:bCs/>
-                            <w:w w:val="105"/>
-                            <w:sz w:val="24"/>
-                            <w:szCs w:val="24"/>
-                          </w:rPr>
-                          <w:t xml:space="preserve">Version Control: </w:t>
-                        </w:r>
-                        <w:r>
-                          <w:rPr>
-                            <w:rFonts w:ascii="Arial" w:hAnsi="Arial" w:cs="Arial"/>
-                            <w:w w:val="105"/>
-                          </w:rPr>
-                          <w:t>Git/Gerrit</w:t>
-                        </w:r>
-                        <w:r>
-                          <w:rPr>
-                            <w:rFonts w:ascii="Arial" w:hAnsi="Arial" w:cs="Arial"/>
-                            <w:b/>
-                            <w:bCs/>
-                            <w:w w:val="105"/>
-                            <w:sz w:val="24"/>
-                            <w:szCs w:val="24"/>
-                          </w:rPr>
-                          <w:t xml:space="preserve"> </w:t>
-                        </w:r>
-                      </w:p>
-                      <w:p>
-                        <w:pPr>
-                          <w:spacing w:before="179" w:line="0" w:lineRule="atLeast"/>
-                          <w:ind w:right="128"/>
-                          <w:rPr>
-                            <w:rFonts w:ascii="Arial" w:hAnsi="Arial" w:cs="Arial"/>
                             <w:w w:val="105"/>
                           </w:rPr>
                         </w:pPr>
@@ -3483,18 +3470,7 @@
                             <w:sz w:val="24"/>
                             <w:szCs w:val="24"/>
                           </w:rPr>
-                          <w:t>Programming Languages</w:t>
-                        </w:r>
-                        <w:r>
-                          <w:rPr>
-                            <w:rFonts w:ascii="Arial" w:hAnsi="Arial" w:cs="Arial"/>
-                            <w:b/>
-                            <w:bCs/>
-                            <w:w w:val="105"/>
-                            <w:sz w:val="24"/>
-                            <w:szCs w:val="24"/>
-                          </w:rPr>
-                          <w:t>:</w:t>
+                          <w:t>Programming Languages:</w:t>
                         </w:r>
                         <w:r>
                           <w:t xml:space="preserve"> </w:t>
@@ -3503,19 +3479,7 @@
                           <w:rPr>
                             <w:rFonts w:ascii="Arial" w:hAnsi="Arial" w:cs="Arial"/>
                           </w:rPr>
-                          <w:t xml:space="preserve">Embedded C, </w:t>
-                        </w:r>
-                        <w:r>
-                          <w:rPr>
-                            <w:rFonts w:ascii="Arial" w:hAnsi="Arial" w:cs="Arial"/>
-                          </w:rPr>
-                          <w:t>C++,</w:t>
-                        </w:r>
-                        <w:r>
-                          <w:rPr>
-                            <w:rFonts w:ascii="Arial" w:hAnsi="Arial" w:cs="Arial"/>
-                          </w:rPr>
-                          <w:t xml:space="preserve"> Shell Script</w:t>
+                          <w:t>Embedded C, C++, Shell Script</w:t>
                         </w:r>
                       </w:p>
                       <w:p>
@@ -3577,18 +3541,7 @@
                             <w:sz w:val="24"/>
                             <w:szCs w:val="24"/>
                           </w:rPr>
-                          <w:t>Protocols &amp; IoT Edge Devices</w:t>
-                        </w:r>
-                        <w:r>
-                          <w:rPr>
-                            <w:rFonts w:ascii="Arial" w:hAnsi="Arial" w:cs="Arial"/>
-                            <w:b/>
-                            <w:bCs/>
-                            <w:w w:val="105"/>
-                            <w:sz w:val="24"/>
-                            <w:szCs w:val="24"/>
-                          </w:rPr>
-                          <w:t>:</w:t>
+                          <w:t>Protocols &amp; IoT Edge Devices:</w:t>
                         </w:r>
                         <w:r>
                           <w:t xml:space="preserve"> </w:t>
@@ -3807,7 +3760,7 @@
         <mc:AlternateContent>
           <mc:Choice Requires="wps">
             <w:drawing>
-              <wp:anchor distT="0" distB="0" distL="114300" distR="114300" simplePos="0" relativeHeight="251670528" behindDoc="1" locked="0" layoutInCell="1" allowOverlap="1" wp14:anchorId="706624B1" wp14:editId="198F60B5">
+              <wp:anchor distT="0" distB="0" distL="114300" distR="114300" simplePos="0" relativeHeight="251667456" behindDoc="1" locked="0" layoutInCell="1" allowOverlap="1" wp14:anchorId="706624B1" wp14:editId="68173371">
                 <wp:simplePos x="0" y="0"/>
                 <wp:positionH relativeFrom="margin">
                   <wp:align>right</wp:align>
@@ -3865,7 +3818,7 @@
           </mc:Choice>
           <mc:Fallback>
             <w:pict>
-              <v:line w14:anchorId="1013C5D6" id="Straight Connector 611662863" o:spid="_x0000_s1026" style="position:absolute;z-index:-251645952;visibility:visible;mso-wrap-style:square;mso-width-percent:0;mso-height-percent:0;mso-wrap-distance-left:9pt;mso-wrap-distance-top:0;mso-wrap-distance-right:9pt;mso-wrap-distance-bottom:0;mso-position-horizontal:right;mso-position-horizontal-relative:margin;mso-position-vertical:absolute;mso-position-vertical-relative:text;mso-width-percent:0;mso-height-percent:0;mso-width-relative:margin;mso-height-relative:margin" from="486pt,23pt" to="1023.2pt,23.75pt" o:gfxdata="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" stroked="f" strokeweight="1pt">
+              <v:line w14:anchorId="4C28CAF8" id="Straight Connector 611662863" o:spid="_x0000_s1026" style="position:absolute;z-index:-251649024;visibility:visible;mso-wrap-style:square;mso-width-percent:0;mso-height-percent:0;mso-wrap-distance-left:9pt;mso-wrap-distance-top:0;mso-wrap-distance-right:9pt;mso-wrap-distance-bottom:0;mso-position-horizontal:right;mso-position-horizontal-relative:margin;mso-position-vertical:absolute;mso-position-vertical-relative:text;mso-width-percent:0;mso-height-percent:0;mso-width-relative:margin;mso-height-relative:margin" from="486pt,23pt" to="1023.2pt,23.75pt" o:gfxdata="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" stroked="f" strokeweight="1pt">
                 <v:stroke joinstyle="miter"/>
                 <w10:wrap anchorx="margin"/>
               </v:line>
@@ -3890,7 +3843,7 @@
         <mc:AlternateContent>
           <mc:Choice Requires="wps">
             <w:drawing>
-              <wp:anchor distT="0" distB="0" distL="114300" distR="114300" simplePos="0" relativeHeight="251640832" behindDoc="1" locked="0" layoutInCell="1" allowOverlap="1" wp14:anchorId="40B6BBE3" wp14:editId="0C1A6D1B">
+              <wp:anchor distT="0" distB="0" distL="114300" distR="114300" simplePos="0" relativeHeight="251637760" behindDoc="1" locked="0" layoutInCell="1" allowOverlap="1" wp14:anchorId="40B6BBE3" wp14:editId="41DB2CB5">
                 <wp:simplePos x="0" y="0"/>
                 <wp:positionH relativeFrom="margin">
                   <wp:align>right</wp:align>
@@ -3945,7 +3898,7 @@
           </mc:Choice>
           <mc:Fallback>
             <w:pict>
-              <v:line w14:anchorId="4B28E7FE" id="Straight Connector 3" o:spid="_x0000_s1026" style="position:absolute;flip:y;z-index:-251675648;visibility:visible;mso-wrap-style:square;mso-width-percent:0;mso-height-percent:0;mso-wrap-distance-left:9pt;mso-wrap-distance-top:0;mso-wrap-distance-right:9pt;mso-wrap-distance-bottom:0;mso-position-horizontal:right;mso-position-horizontal-relative:margin;mso-position-vertical:absolute;mso-position-vertical-relative:text;mso-width-percent:0;mso-height-percent:0;mso-width-relative:margin;mso-height-relative:margin" from="486pt,-.3pt" to="1023.2pt,1.45pt" o:gfxdata="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" strokecolor="#156082 [3204]" strokeweight="1pt">
+              <v:line w14:anchorId="38D924D3" id="Straight Connector 3" o:spid="_x0000_s1026" style="position:absolute;flip:y;z-index:-251678720;visibility:visible;mso-wrap-style:square;mso-width-percent:0;mso-height-percent:0;mso-wrap-distance-left:9pt;mso-wrap-distance-top:0;mso-wrap-distance-right:9pt;mso-wrap-distance-bottom:0;mso-position-horizontal:right;mso-position-horizontal-relative:margin;mso-position-vertical:absolute;mso-position-vertical-relative:text;mso-width-percent:0;mso-height-percent:0;mso-width-relative:margin;mso-height-relative:margin" from="486pt,-.3pt" to="1023.2pt,1.45pt" o:gfxdata="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" strokecolor="#156082 [3204]" strokeweight="1pt">
                 <v:stroke joinstyle="miter"/>
                 <w10:wrap anchorx="margin"/>
               </v:line>
@@ -3963,7 +3916,7 @@
         <mc:AlternateContent>
           <mc:Choice Requires="wps">
             <w:drawing>
-              <wp:anchor distT="0" distB="0" distL="114300" distR="114300" simplePos="0" relativeHeight="251693056" behindDoc="1" locked="0" layoutInCell="1" allowOverlap="1" wp14:anchorId="7ED1DBEE" wp14:editId="41CCCDAB">
+              <wp:anchor distT="0" distB="0" distL="114300" distR="114300" simplePos="0" relativeHeight="251689984" behindDoc="1" locked="0" layoutInCell="1" allowOverlap="1" wp14:anchorId="7ED1DBEE" wp14:editId="6E2EBE39">
                 <wp:simplePos x="0" y="0"/>
                 <wp:positionH relativeFrom="column">
                   <wp:align>right</wp:align>
@@ -3971,8 +3924,8 @@
                 <wp:positionV relativeFrom="paragraph">
                   <wp:posOffset>4473</wp:posOffset>
                 </wp:positionV>
-                <wp:extent cx="3196258" cy="3442914"/>
-                <wp:effectExtent l="0" t="0" r="4445" b="5715"/>
+                <wp:extent cx="3196258" cy="4419600"/>
+                <wp:effectExtent l="0" t="0" r="4445" b="0"/>
                 <wp:wrapNone/>
                 <wp:docPr id="546836763" name="Text Box 2"/>
                 <wp:cNvGraphicFramePr>
@@ -3987,7 +3940,7 @@
                       <wps:spPr bwMode="auto">
                         <a:xfrm>
                           <a:off x="0" y="0"/>
-                          <a:ext cx="3196258" cy="3442914"/>
+                          <a:ext cx="3196258" cy="4419600"/>
                         </a:xfrm>
                         <a:prstGeom prst="rect">
                           <a:avLst/>
@@ -4137,8 +4090,8 @@
                             <w:pPr>
                               <w:pStyle w:val="ListParagraph"/>
                               <w:numPr>
-                                <w:ilvl w:val="1"/>
-                                <w:numId w:val="6"/>
+                                <w:ilvl w:val="0"/>
+                                <w:numId w:val="16"/>
                               </w:numPr>
                               <w:spacing w:after="0"/>
                               <w:rPr>
@@ -4151,7 +4104,7 @@
                                 <w:rFonts w:ascii="Arial" w:hAnsi="Arial" w:cs="Arial"/>
                                 <w:w w:val="105"/>
                               </w:rPr>
-                              <w:t>Edgexconnect is a server host information model data of sensors and loads etc.., using client can control load and check sensor values by read and write operation</w:t>
+                              <w:t>Developed Formula V3 Steering Wheel firmware using Zephyr RTOS, including wheel-to-wheelbase compatibility development. Delivered product integration, testing, release activities, and sustainability bug fixes for existing Corsair (Endor) sim racing products.</w:t>
                             </w:r>
                           </w:p>
                           <w:p>
@@ -4201,21 +4154,20 @@
                             <w:pPr>
                               <w:pStyle w:val="ListParagraph"/>
                               <w:numPr>
-                                <w:ilvl w:val="1"/>
-                                <w:numId w:val="6"/>
+                                <w:ilvl w:val="0"/>
+                                <w:numId w:val="16"/>
                               </w:numPr>
                               <w:spacing w:after="0"/>
                               <w:rPr>
                                 <w:rFonts w:ascii="Arial" w:hAnsi="Arial" w:cs="Arial"/>
-                                <w:w w:val="105"/>
+                                <w:color w:val="2DBCAC"/>
                               </w:rPr>
                             </w:pPr>
                             <w:r>
                               <w:rPr>
                                 <w:rFonts w:ascii="Arial" w:hAnsi="Arial" w:cs="Arial"/>
-                                <w:w w:val="105"/>
-                              </w:rPr>
-                              <w:t>Edgexconnect is a server host information model data of sensors and loads etc.., using client can control load and check sensor values by read and write operation</w:t>
+                              </w:rPr>
+                              <w:t>Led firmware development for Handbrake and PVGT Porsche Steering Wheel products using Zephyr RTOS, developing sensor and CAN modules, mentoring junior engineers, integrating system components, performing end-to-end testing, and supporting wheelbase compatibility and product release.</w:t>
                             </w:r>
                           </w:p>
                         </w:txbxContent>
@@ -4237,7 +4189,7 @@
           </mc:Choice>
           <mc:Fallback>
             <w:pict>
-              <v:shape w14:anchorId="7ED1DBEE" id="_x0000_s1038" type="#_x0000_t202" style="position:absolute;margin-left:200.45pt;margin-top:.35pt;width:251.65pt;height:271.1pt;z-index:-251623424;visibility:visible;mso-wrap-style:square;mso-width-percent:0;mso-height-percent:0;mso-wrap-distance-left:9pt;mso-wrap-distance-top:0;mso-wrap-distance-right:9pt;mso-wrap-distance-bottom:0;mso-position-horizontal:right;mso-position-horizontal-relative:text;mso-position-vertical:absolute;mso-position-vertical-relative:text;mso-width-percent:0;mso-height-percent:0;mso-width-relative:margin;mso-height-relative:margin;v-text-anchor:top" o:gfxdata="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" fillcolor="white [3201]" stroked="f" strokeweight="1.5pt">
+              <v:shape w14:anchorId="7ED1DBEE" id="_x0000_s1038" type="#_x0000_t202" style="position:absolute;margin-left:200.45pt;margin-top:.35pt;width:251.65pt;height:348pt;z-index:-251626496;visibility:visible;mso-wrap-style:square;mso-width-percent:0;mso-height-percent:0;mso-wrap-distance-left:9pt;mso-wrap-distance-top:0;mso-wrap-distance-right:9pt;mso-wrap-distance-bottom:0;mso-position-horizontal:right;mso-position-horizontal-relative:text;mso-position-vertical:absolute;mso-position-vertical-relative:text;mso-width-percent:0;mso-height-percent:0;mso-width-relative:margin;mso-height-relative:margin;v-text-anchor:top" o:gfxdata="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" fillcolor="white [3201]" stroked="f" strokeweight="1.5pt">
                 <v:textbox>
                   <w:txbxContent>
                     <w:p>
@@ -4363,8 +4315,8 @@
                       <w:pPr>
                         <w:pStyle w:val="ListParagraph"/>
                         <w:numPr>
-                          <w:ilvl w:val="1"/>
-                          <w:numId w:val="6"/>
+                          <w:ilvl w:val="0"/>
+                          <w:numId w:val="16"/>
                         </w:numPr>
                         <w:spacing w:after="0"/>
                         <w:rPr>
@@ -4377,7 +4329,7 @@
                           <w:rFonts w:ascii="Arial" w:hAnsi="Arial" w:cs="Arial"/>
                           <w:w w:val="105"/>
                         </w:rPr>
-                        <w:t>Edgexconnect is a server host information model data of sensors and loads etc.., using client can control load and check sensor values by read and write operation</w:t>
+                        <w:t>Developed Formula V3 Steering Wheel firmware using Zephyr RTOS, including wheel-to-wheelbase compatibility development. Delivered product integration, testing, release activities, and sustainability bug fixes for existing Corsair (Endor) sim racing products.</w:t>
                       </w:r>
                     </w:p>
                     <w:p>
@@ -4427,21 +4379,20 @@
                       <w:pPr>
                         <w:pStyle w:val="ListParagraph"/>
                         <w:numPr>
-                          <w:ilvl w:val="1"/>
-                          <w:numId w:val="6"/>
+                          <w:ilvl w:val="0"/>
+                          <w:numId w:val="16"/>
                         </w:numPr>
                         <w:spacing w:after="0"/>
                         <w:rPr>
                           <w:rFonts w:ascii="Arial" w:hAnsi="Arial" w:cs="Arial"/>
-                          <w:w w:val="105"/>
+                          <w:color w:val="2DBCAC"/>
                         </w:rPr>
                       </w:pPr>
                       <w:r>
                         <w:rPr>
                           <w:rFonts w:ascii="Arial" w:hAnsi="Arial" w:cs="Arial"/>
-                          <w:w w:val="105"/>
-                        </w:rPr>
-                        <w:t>Edgexconnect is a server host information model data of sensors and loads etc.., using client can control load and check sensor values by read and write operation</w:t>
+                        </w:rPr>
+                        <w:t>Led firmware development for Handbrake and PVGT Porsche Steering Wheel products using Zephyr RTOS, developing sensor and CAN modules, mentoring junior engineers, integrating system components, performing end-to-end testing, and supporting wheelbase compatibility and product release.</w:t>
                       </w:r>
                     </w:p>
                   </w:txbxContent>
@@ -4457,7 +4408,7 @@
           <w14:ligatures w14:val="standardContextual"/>
         </w:rPr>
         <w:drawing>
-          <wp:anchor distT="0" distB="0" distL="114300" distR="114300" simplePos="0" relativeHeight="251694080" behindDoc="1" locked="0" layoutInCell="1" allowOverlap="1" wp14:anchorId="3030B400" wp14:editId="68FAE732">
+          <wp:anchor distT="0" distB="0" distL="114300" distR="114300" simplePos="0" relativeHeight="251691008" behindDoc="1" locked="0" layoutInCell="1" allowOverlap="1" wp14:anchorId="3030B400" wp14:editId="12448094">
             <wp:simplePos x="0" y="0"/>
             <wp:positionH relativeFrom="column">
               <wp:posOffset>99391</wp:posOffset>
@@ -4529,6 +4480,10 @@
     <w:p/>
     <w:p/>
     <w:p/>
+    <w:p/>
+    <w:p/>
+    <w:p/>
+    <w:p/>
     <w:p>
       <w:r>
         <w:rPr>
@@ -4538,16 +4493,16 @@
         <mc:AlternateContent>
           <mc:Choice Requires="wps">
             <w:drawing>
-              <wp:anchor distT="0" distB="0" distL="114300" distR="114300" simplePos="0" relativeHeight="251680768" behindDoc="1" locked="0" layoutInCell="1" allowOverlap="1" wp14:anchorId="12547556" wp14:editId="6E0C87B2">
+              <wp:anchor distT="0" distB="0" distL="114300" distR="114300" simplePos="0" relativeHeight="251677696" behindDoc="1" locked="0" layoutInCell="1" allowOverlap="1" wp14:anchorId="12547556" wp14:editId="3B56EC54">
                 <wp:simplePos x="0" y="0"/>
                 <wp:positionH relativeFrom="column">
                   <wp:align>right</wp:align>
                 </wp:positionH>
                 <wp:positionV relativeFrom="paragraph">
-                  <wp:posOffset>59414</wp:posOffset>
+                  <wp:posOffset>5715</wp:posOffset>
                 </wp:positionV>
-                <wp:extent cx="3203907" cy="1598212"/>
-                <wp:effectExtent l="0" t="0" r="0" b="2540"/>
+                <wp:extent cx="3195955" cy="1706880"/>
+                <wp:effectExtent l="0" t="0" r="4445" b="7620"/>
                 <wp:wrapNone/>
                 <wp:docPr id="16" name="Text Box 2"/>
                 <wp:cNvGraphicFramePr>
@@ -4562,7 +4517,7 @@
                       <wps:spPr bwMode="auto">
                         <a:xfrm>
                           <a:off x="0" y="0"/>
-                          <a:ext cx="3203907" cy="1598212"/>
+                          <a:ext cx="3195955" cy="1706880"/>
                         </a:xfrm>
                         <a:prstGeom prst="rect">
                           <a:avLst/>
@@ -4610,30 +4565,29 @@
                                 <w:sz w:val="24"/>
                                 <w:szCs w:val="24"/>
                               </w:rPr>
-                              <w:t xml:space="preserve">Client: Beeond </w:t>
+                              <w:t xml:space="preserve">Client: </w:t>
                             </w:r>
-                          </w:p>
-                          <w:p>
-                            <w:pPr>
-                              <w:spacing w:after="0"/>
-                              <w:rPr>
-                                <w:rFonts w:ascii="Arial" w:hAnsi="Arial" w:cs="Arial"/>
-                                <w:w w:val="105"/>
-                              </w:rPr>
-                            </w:pPr>
+                            <w:proofErr w:type="spellStart"/>
                             <w:r>
                               <w:rPr>
                                 <w:rFonts w:ascii="Arial" w:hAnsi="Arial" w:cs="Arial"/>
+                                <w:b/>
+                                <w:bCs/>
                                 <w:w w:val="105"/>
                                 <w:sz w:val="24"/>
                                 <w:szCs w:val="24"/>
                               </w:rPr>
-                              <w:t>Edgexconnet – The configurable No-code OPC UA Server</w:t>
+                              <w:t>Beeond</w:t>
                             </w:r>
+                            <w:proofErr w:type="spellEnd"/>
                             <w:r>
                               <w:rPr>
                                 <w:rFonts w:ascii="Arial" w:hAnsi="Arial" w:cs="Arial"/>
+                                <w:b/>
+                                <w:bCs/>
                                 <w:w w:val="105"/>
+                                <w:sz w:val="24"/>
+                                <w:szCs w:val="24"/>
                               </w:rPr>
                               <w:t xml:space="preserve"> </w:t>
                             </w:r>
@@ -4644,10 +4598,49 @@
                               <w:rPr>
                                 <w:rFonts w:ascii="Arial" w:hAnsi="Arial" w:cs="Arial"/>
                                 <w:w w:val="105"/>
+                              </w:rPr>
+                            </w:pPr>
+                            <w:r>
+                              <w:rPr>
+                                <w:rFonts w:ascii="Arial" w:hAnsi="Arial" w:cs="Arial"/>
+                                <w:w w:val="105"/>
                                 <w:sz w:val="24"/>
                                 <w:szCs w:val="24"/>
                               </w:rPr>
+                              <w:t>Edgexconnet – The configurable No-code OPC UA Server</w:t>
+                            </w:r>
+                            <w:r>
+                              <w:rPr>
+                                <w:rFonts w:ascii="Arial" w:hAnsi="Arial" w:cs="Arial"/>
+                                <w:w w:val="105"/>
+                              </w:rPr>
+                              <w:t xml:space="preserve"> </w:t>
+                            </w:r>
+                          </w:p>
+                          <w:p>
+                            <w:pPr>
+                              <w:spacing w:after="0"/>
+                              <w:rPr>
+                                <w:rFonts w:ascii="Arial" w:hAnsi="Arial" w:cs="Arial"/>
+                                <w:w w:val="105"/>
+                                <w:sz w:val="24"/>
+                                <w:szCs w:val="24"/>
+                              </w:rPr>
                             </w:pPr>
+                            <w:r>
+                              <w:rPr>
+                                <w:rFonts w:ascii="Arial" w:hAnsi="Arial" w:cs="Arial"/>
+                                <w:color w:val="2DBCAC"/>
+                              </w:rPr>
+                              <w:t xml:space="preserve">    </w:t>
+                            </w:r>
+                            <w:r>
+                              <w:rPr>
+                                <w:rFonts w:ascii="Arial" w:hAnsi="Arial" w:cs="Arial"/>
+                                <w:color w:val="2DBCAC"/>
+                              </w:rPr>
+                              <w:t xml:space="preserve">  </w:t>
+                            </w:r>
                             <w:r>
                               <w:rPr>
                                 <w:rFonts w:ascii="Arial" w:hAnsi="Arial" w:cs="Arial"/>
@@ -4661,7 +4654,7 @@
                               <w:pStyle w:val="ListParagraph"/>
                               <w:numPr>
                                 <w:ilvl w:val="0"/>
-                                <w:numId w:val="6"/>
+                                <w:numId w:val="17"/>
                               </w:numPr>
                               <w:spacing w:after="0"/>
                               <w:rPr>
@@ -4674,7 +4667,23 @@
                                 <w:rFonts w:ascii="Arial" w:hAnsi="Arial" w:cs="Arial"/>
                                 <w:w w:val="105"/>
                               </w:rPr>
-                              <w:t>Edgexconnect is a server host information model data of sensors and loads etc.., using client can control load and check sensor values by read and write operation</w:t>
+                              <w:t xml:space="preserve">Worked on the </w:t>
+                            </w:r>
+                            <w:proofErr w:type="spellStart"/>
+                            <w:r>
+                              <w:rPr>
+                                <w:rFonts w:ascii="Arial" w:hAnsi="Arial" w:cs="Arial"/>
+                                <w:w w:val="105"/>
+                              </w:rPr>
+                              <w:t>EdgeXConnect</w:t>
+                            </w:r>
+                            <w:proofErr w:type="spellEnd"/>
+                            <w:r>
+                              <w:rPr>
+                                <w:rFonts w:ascii="Arial" w:hAnsi="Arial" w:cs="Arial"/>
+                                <w:w w:val="105"/>
+                              </w:rPr>
+                              <w:t xml:space="preserve"> project, fixing defects in a C++ application and contributing to OPC UA integration, testing, and system maintenance activities.</w:t>
                             </w:r>
                           </w:p>
                         </w:txbxContent>
@@ -4696,7 +4705,7 @@
           </mc:Choice>
           <mc:Fallback>
             <w:pict>
-              <v:shape w14:anchorId="12547556" id="_x0000_s1039" type="#_x0000_t202" style="position:absolute;margin-left:201.1pt;margin-top:4.7pt;width:252.3pt;height:125.85pt;z-index:-251635712;visibility:visible;mso-wrap-style:square;mso-width-percent:0;mso-height-percent:0;mso-wrap-distance-left:9pt;mso-wrap-distance-top:0;mso-wrap-distance-right:9pt;mso-wrap-distance-bottom:0;mso-position-horizontal:right;mso-position-horizontal-relative:text;mso-position-vertical:absolute;mso-position-vertical-relative:text;mso-width-percent:0;mso-height-percent:0;mso-width-relative:margin;mso-height-relative:margin;v-text-anchor:top" o:gfxdata="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" fillcolor="white [3201]" stroked="f" strokeweight="1.5pt">
+              <v:shape w14:anchorId="12547556" id="_x0000_s1039" type="#_x0000_t202" style="position:absolute;margin-left:200.45pt;margin-top:.45pt;width:251.65pt;height:134.4pt;z-index:-251638784;visibility:visible;mso-wrap-style:square;mso-width-percent:0;mso-height-percent:0;mso-wrap-distance-left:9pt;mso-wrap-distance-top:0;mso-wrap-distance-right:9pt;mso-wrap-distance-bottom:0;mso-position-horizontal:right;mso-position-horizontal-relative:text;mso-position-vertical:absolute;mso-position-vertical-relative:text;mso-width-percent:0;mso-height-percent:0;mso-width-relative:margin;mso-height-relative:margin;v-text-anchor:top" o:gfxdata="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" fillcolor="white [3201]" stroked="f" strokeweight="1.5pt">
                 <v:textbox>
                   <w:txbxContent>
                     <w:p>
@@ -4720,30 +4729,29 @@
                           <w:sz w:val="24"/>
                           <w:szCs w:val="24"/>
                         </w:rPr>
-                        <w:t xml:space="preserve">Client: Beeond </w:t>
+                        <w:t xml:space="preserve">Client: </w:t>
                       </w:r>
-                    </w:p>
-                    <w:p>
-                      <w:pPr>
-                        <w:spacing w:after="0"/>
-                        <w:rPr>
-                          <w:rFonts w:ascii="Arial" w:hAnsi="Arial" w:cs="Arial"/>
-                          <w:w w:val="105"/>
-                        </w:rPr>
-                      </w:pPr>
+                      <w:proofErr w:type="spellStart"/>
                       <w:r>
                         <w:rPr>
                           <w:rFonts w:ascii="Arial" w:hAnsi="Arial" w:cs="Arial"/>
+                          <w:b/>
+                          <w:bCs/>
                           <w:w w:val="105"/>
                           <w:sz w:val="24"/>
                           <w:szCs w:val="24"/>
                         </w:rPr>
-                        <w:t>Edgexconnet – The configurable No-code OPC UA Server</w:t>
+                        <w:t>Beeond</w:t>
                       </w:r>
+                      <w:proofErr w:type="spellEnd"/>
                       <w:r>
                         <w:rPr>
                           <w:rFonts w:ascii="Arial" w:hAnsi="Arial" w:cs="Arial"/>
+                          <w:b/>
+                          <w:bCs/>
                           <w:w w:val="105"/>
+                          <w:sz w:val="24"/>
+                          <w:szCs w:val="24"/>
                         </w:rPr>
                         <w:t xml:space="preserve"> </w:t>
                       </w:r>
@@ -4754,10 +4762,49 @@
                         <w:rPr>
                           <w:rFonts w:ascii="Arial" w:hAnsi="Arial" w:cs="Arial"/>
                           <w:w w:val="105"/>
+                        </w:rPr>
+                      </w:pPr>
+                      <w:r>
+                        <w:rPr>
+                          <w:rFonts w:ascii="Arial" w:hAnsi="Arial" w:cs="Arial"/>
+                          <w:w w:val="105"/>
                           <w:sz w:val="24"/>
                           <w:szCs w:val="24"/>
                         </w:rPr>
+                        <w:t>Edgexconnet – The configurable No-code OPC UA Server</w:t>
+                      </w:r>
+                      <w:r>
+                        <w:rPr>
+                          <w:rFonts w:ascii="Arial" w:hAnsi="Arial" w:cs="Arial"/>
+                          <w:w w:val="105"/>
+                        </w:rPr>
+                        <w:t xml:space="preserve"> </w:t>
+                      </w:r>
+                    </w:p>
+                    <w:p>
+                      <w:pPr>
+                        <w:spacing w:after="0"/>
+                        <w:rPr>
+                          <w:rFonts w:ascii="Arial" w:hAnsi="Arial" w:cs="Arial"/>
+                          <w:w w:val="105"/>
+                          <w:sz w:val="24"/>
+                          <w:szCs w:val="24"/>
+                        </w:rPr>
                       </w:pPr>
+                      <w:r>
+                        <w:rPr>
+                          <w:rFonts w:ascii="Arial" w:hAnsi="Arial" w:cs="Arial"/>
+                          <w:color w:val="2DBCAC"/>
+                        </w:rPr>
+                        <w:t xml:space="preserve">    </w:t>
+                      </w:r>
+                      <w:r>
+                        <w:rPr>
+                          <w:rFonts w:ascii="Arial" w:hAnsi="Arial" w:cs="Arial"/>
+                          <w:color w:val="2DBCAC"/>
+                        </w:rPr>
+                        <w:t xml:space="preserve">  </w:t>
+                      </w:r>
                       <w:r>
                         <w:rPr>
                           <w:rFonts w:ascii="Arial" w:hAnsi="Arial" w:cs="Arial"/>
@@ -4771,7 +4818,7 @@
                         <w:pStyle w:val="ListParagraph"/>
                         <w:numPr>
                           <w:ilvl w:val="0"/>
-                          <w:numId w:val="6"/>
+                          <w:numId w:val="17"/>
                         </w:numPr>
                         <w:spacing w:after="0"/>
                         <w:rPr>
@@ -4784,7 +4831,23 @@
                           <w:rFonts w:ascii="Arial" w:hAnsi="Arial" w:cs="Arial"/>
                           <w:w w:val="105"/>
                         </w:rPr>
-                        <w:t>Edgexconnect is a server host information model data of sensors and loads etc.., using client can control load and check sensor values by read and write operation</w:t>
+                        <w:t xml:space="preserve">Worked on the </w:t>
+                      </w:r>
+                      <w:proofErr w:type="spellStart"/>
+                      <w:r>
+                        <w:rPr>
+                          <w:rFonts w:ascii="Arial" w:hAnsi="Arial" w:cs="Arial"/>
+                          <w:w w:val="105"/>
+                        </w:rPr>
+                        <w:t>EdgeXConnect</w:t>
+                      </w:r>
+                      <w:proofErr w:type="spellEnd"/>
+                      <w:r>
+                        <w:rPr>
+                          <w:rFonts w:ascii="Arial" w:hAnsi="Arial" w:cs="Arial"/>
+                          <w:w w:val="105"/>
+                        </w:rPr>
+                        <w:t xml:space="preserve"> project, fixing defects in a C++ application and contributing to OPC UA integration, testing, and system maintenance activities.</w:t>
                       </w:r>
                     </w:p>
                   </w:txbxContent>
@@ -4810,16 +4873,16 @@
         <mc:AlternateContent>
           <mc:Choice Requires="wps">
             <w:drawing>
-              <wp:anchor distT="45720" distB="45720" distL="114300" distR="114300" simplePos="0" relativeHeight="251685888" behindDoc="1" locked="0" layoutInCell="1" allowOverlap="1" wp14:anchorId="537E4130" wp14:editId="71BEB817">
+              <wp:anchor distT="45720" distB="45720" distL="114300" distR="114300" simplePos="0" relativeHeight="251682816" behindDoc="1" locked="0" layoutInCell="1" allowOverlap="1" wp14:anchorId="537E4130" wp14:editId="4073DB41">
                 <wp:simplePos x="0" y="0"/>
-                <wp:positionH relativeFrom="column">
-                  <wp:align>right</wp:align>
+                <wp:positionH relativeFrom="margin">
+                  <wp:align>left</wp:align>
                 </wp:positionH>
                 <wp:positionV relativeFrom="paragraph">
-                  <wp:posOffset>5715</wp:posOffset>
+                  <wp:posOffset>6350</wp:posOffset>
                 </wp:positionV>
-                <wp:extent cx="3195623" cy="2568271"/>
-                <wp:effectExtent l="0" t="0" r="5080" b="3810"/>
+                <wp:extent cx="3180715" cy="2034540"/>
+                <wp:effectExtent l="0" t="0" r="635" b="3810"/>
                 <wp:wrapNone/>
                 <wp:docPr id="1" name="Text Box 2"/>
                 <wp:cNvGraphicFramePr>
@@ -4834,7 +4897,7 @@
                       <wps:spPr bwMode="auto">
                         <a:xfrm>
                           <a:off x="0" y="0"/>
-                          <a:ext cx="3195623" cy="2568271"/>
+                          <a:ext cx="3180715" cy="2034540"/>
                         </a:xfrm>
                         <a:prstGeom prst="rect">
                           <a:avLst/>
@@ -4930,6 +4993,13 @@
                                 <w:rFonts w:ascii="Arial" w:hAnsi="Arial" w:cs="Arial"/>
                                 <w:color w:val="2DBCAC"/>
                               </w:rPr>
+                              <w:t xml:space="preserve">      </w:t>
+                            </w:r>
+                            <w:r>
+                              <w:rPr>
+                                <w:rFonts w:ascii="Arial" w:hAnsi="Arial" w:cs="Arial"/>
+                                <w:color w:val="2DBCAC"/>
+                              </w:rPr>
                               <w:t>(06-2021 - 09-2021)</w:t>
                             </w:r>
                           </w:p>
@@ -4938,7 +5008,7 @@
                               <w:pStyle w:val="ListParagraph"/>
                               <w:numPr>
                                 <w:ilvl w:val="0"/>
-                                <w:numId w:val="8"/>
+                                <w:numId w:val="18"/>
                               </w:numPr>
                               <w:spacing w:after="0"/>
                               <w:rPr>
@@ -4951,32 +5021,219 @@
                                 <w:rFonts w:ascii="Arial" w:hAnsi="Arial" w:cs="Arial"/>
                                 <w:w w:val="105"/>
                               </w:rPr>
-                              <w:t xml:space="preserve">Designed a software prototype model using MAX30100 sensor module to prove the concept, I successfully proved the concept </w:t>
+                              <w:t>Developed embedded firmware for a Three-Layer Conveyor System in textile automation, implementing sensor-based cop routing and solenoid control across multiple controller boards to ensure continuous and balanced material delivery to downstream processes.</w:t>
                             </w:r>
                           </w:p>
+                        </w:txbxContent>
+                      </wps:txbx>
+                      <wps:bodyPr rot="0" vert="horz" wrap="square" lIns="91440" tIns="45720" rIns="91440" bIns="45720" anchor="t" anchorCtr="0">
+                        <a:noAutofit/>
+                      </wps:bodyPr>
+                    </wps:wsp>
+                  </a:graphicData>
+                </a:graphic>
+                <wp14:sizeRelH relativeFrom="margin">
+                  <wp14:pctWidth>0</wp14:pctWidth>
+                </wp14:sizeRelH>
+                <wp14:sizeRelV relativeFrom="margin">
+                  <wp14:pctHeight>0</wp14:pctHeight>
+                </wp14:sizeRelV>
+              </wp:anchor>
+            </w:drawing>
+          </mc:Choice>
+          <mc:Fallback>
+            <w:pict>
+              <v:shape w14:anchorId="537E4130" id="_x0000_s1040" type="#_x0000_t202" style="position:absolute;margin-left:0;margin-top:.5pt;width:250.45pt;height:160.2pt;z-index:-251633664;visibility:visible;mso-wrap-style:square;mso-width-percent:0;mso-height-percent:0;mso-wrap-distance-left:9pt;mso-wrap-distance-top:3.6pt;mso-wrap-distance-right:9pt;mso-wrap-distance-bottom:3.6pt;mso-position-horizontal:left;mso-position-horizontal-relative:margin;mso-position-vertical:absolute;mso-position-vertical-relative:text;mso-width-percent:0;mso-height-percent:0;mso-width-relative:margin;mso-height-relative:margin;v-text-anchor:top" o:gfxdata="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" fillcolor="white [3201]" stroked="f" strokeweight="1.5pt">
+                <v:textbox>
+                  <w:txbxContent>
+                    <w:p>
+                      <w:pPr>
+                        <w:spacing w:after="0"/>
+                        <w:rPr>
+                          <w:rFonts w:ascii="Arial" w:hAnsi="Arial" w:cs="Arial"/>
+                          <w:w w:val="105"/>
+                          <w:sz w:val="24"/>
+                          <w:szCs w:val="24"/>
+                        </w:rPr>
+                      </w:pPr>
+                      <w:r>
+                        <w:rPr>
+                          <w:rFonts w:ascii="Arial" w:hAnsi="Arial" w:cs="Arial"/>
+                          <w:b/>
+                          <w:bCs/>
+                          <w:w w:val="105"/>
+                          <w:sz w:val="24"/>
+                          <w:szCs w:val="24"/>
+                        </w:rPr>
+                        <w:t>Client: Lakshmi Life Sciences Ltd.</w:t>
+                      </w:r>
+                    </w:p>
+                    <w:p>
+                      <w:pPr>
+                        <w:pStyle w:val="ListParagraph"/>
+                        <w:numPr>
+                          <w:ilvl w:val="0"/>
+                          <w:numId w:val="11"/>
+                        </w:numPr>
+                        <w:spacing w:after="0"/>
+                        <w:rPr>
+                          <w:rFonts w:ascii="Arial" w:hAnsi="Arial" w:cs="Arial"/>
+                          <w:w w:val="105"/>
+                          <w:sz w:val="24"/>
+                          <w:szCs w:val="24"/>
+                        </w:rPr>
+                      </w:pPr>
+                      <w:r>
+                        <w:rPr>
+                          <w:rFonts w:ascii="Arial" w:hAnsi="Arial" w:cs="Arial"/>
+                          <w:w w:val="105"/>
+                          <w:sz w:val="24"/>
+                          <w:szCs w:val="24"/>
+                        </w:rPr>
+                        <w:t>Three</w:t>
+                      </w:r>
+                      <w:r>
+                        <w:rPr>
+                          <w:rFonts w:ascii="Arial" w:hAnsi="Arial" w:cs="Arial"/>
+                          <w:w w:val="105"/>
+                          <w:sz w:val="24"/>
+                          <w:szCs w:val="24"/>
+                        </w:rPr>
+                        <w:t xml:space="preserve"> Layer Conveyor system</w:t>
+                      </w:r>
+                    </w:p>
+                    <w:p>
+                      <w:pPr>
+                        <w:spacing w:after="0"/>
+                        <w:rPr>
+                          <w:rFonts w:ascii="Arial" w:hAnsi="Arial" w:cs="Arial"/>
+                          <w:color w:val="2DBCAC"/>
+                        </w:rPr>
+                      </w:pPr>
+                      <w:r>
+                        <w:rPr>
+                          <w:rFonts w:ascii="Arial" w:hAnsi="Arial" w:cs="Arial"/>
+                          <w:color w:val="2DBCAC"/>
+                        </w:rPr>
+                        <w:t xml:space="preserve">      </w:t>
+                      </w:r>
+                      <w:r>
+                        <w:rPr>
+                          <w:rFonts w:ascii="Arial" w:hAnsi="Arial" w:cs="Arial"/>
+                          <w:color w:val="2DBCAC"/>
+                        </w:rPr>
+                        <w:t>(06-2021 - 09-2021)</w:t>
+                      </w:r>
+                    </w:p>
+                    <w:p>
+                      <w:pPr>
+                        <w:pStyle w:val="ListParagraph"/>
+                        <w:numPr>
+                          <w:ilvl w:val="0"/>
+                          <w:numId w:val="18"/>
+                        </w:numPr>
+                        <w:spacing w:after="0"/>
+                        <w:rPr>
+                          <w:rFonts w:ascii="Arial" w:hAnsi="Arial" w:cs="Arial"/>
+                          <w:w w:val="105"/>
+                        </w:rPr>
+                      </w:pPr>
+                      <w:r>
+                        <w:rPr>
+                          <w:rFonts w:ascii="Arial" w:hAnsi="Arial" w:cs="Arial"/>
+                          <w:w w:val="105"/>
+                        </w:rPr>
+                        <w:t>Developed embedded firmware for a Three-Layer Conveyor System in textile automation, implementing sensor-based cop routing and solenoid control across multiple controller boards to ensure continuous and balanced material delivery to downstream processes.</w:t>
+                      </w:r>
+                    </w:p>
+                  </w:txbxContent>
+                </v:textbox>
+                <w10:wrap anchorx="margin"/>
+              </v:shape>
+            </w:pict>
+          </mc:Fallback>
+        </mc:AlternateContent>
+      </w:r>
+    </w:p>
+    <w:p/>
+    <w:p/>
+    <w:p/>
+    <w:p/>
+    <w:p/>
+    <w:p/>
+    <w:p>
+      <w:r>
+        <w:rPr>
+          <w:rFonts w:ascii="Arial" w:hAnsi="Arial" w:cs="Arial"/>
+          <w:noProof/>
+          <w:lang w:val="en-US"/>
+        </w:rPr>
+        <mc:AlternateContent>
+          <mc:Choice Requires="wps">
+            <w:drawing>
+              <wp:anchor distT="45720" distB="45720" distL="114300" distR="114300" simplePos="0" relativeHeight="251697152" behindDoc="1" locked="0" layoutInCell="1" allowOverlap="1" wp14:anchorId="63840334" wp14:editId="17D8BCFC">
+                <wp:simplePos x="0" y="0"/>
+                <wp:positionH relativeFrom="margin">
+                  <wp:align>left</wp:align>
+                </wp:positionH>
+                <wp:positionV relativeFrom="paragraph">
+                  <wp:posOffset>12700</wp:posOffset>
+                </wp:positionV>
+                <wp:extent cx="755015" cy="495300"/>
+                <wp:effectExtent l="0" t="0" r="6985" b="0"/>
+                <wp:wrapNone/>
+                <wp:docPr id="20" name="Text Box 2"/>
+                <wp:cNvGraphicFramePr>
+                  <a:graphicFrameLocks xmlns:a="http://schemas.openxmlformats.org/drawingml/2006/main"/>
+                </wp:cNvGraphicFramePr>
+                <a:graphic xmlns:a="http://schemas.openxmlformats.org/drawingml/2006/main">
+                  <a:graphicData uri="http://schemas.microsoft.com/office/word/2010/wordprocessingShape">
+                    <wps:wsp>
+                      <wps:cNvSpPr txBox="1">
+                        <a:spLocks noChangeArrowheads="1"/>
+                      </wps:cNvSpPr>
+                      <wps:spPr bwMode="auto">
+                        <a:xfrm>
+                          <a:off x="0" y="0"/>
+                          <a:ext cx="755015" cy="495300"/>
+                        </a:xfrm>
+                        <a:prstGeom prst="rect">
+                          <a:avLst/>
+                        </a:prstGeom>
+                        <a:solidFill>
+                          <a:srgbClr val="FFFFFF"/>
+                        </a:solidFill>
+                        <a:ln w="9525">
+                          <a:noFill/>
+                          <a:miter lim="800000"/>
+                          <a:headEnd/>
+                          <a:tailEnd/>
+                        </a:ln>
+                      </wps:spPr>
+                      <wps:txbx>
+                        <w:txbxContent>
                           <w:p>
                             <w:pPr>
-                              <w:pStyle w:val="ListParagraph"/>
-                              <w:numPr>
-                                <w:ilvl w:val="0"/>
-                                <w:numId w:val="11"/>
-                              </w:numPr>
                               <w:spacing w:after="0"/>
                               <w:rPr>
                                 <w:rFonts w:ascii="Arial" w:hAnsi="Arial" w:cs="Arial"/>
                                 <w:w w:val="105"/>
-                                <w:sz w:val="24"/>
-                                <w:szCs w:val="24"/>
                               </w:rPr>
                             </w:pPr>
                             <w:r>
                               <w:rPr>
                                 <w:rFonts w:ascii="Arial" w:hAnsi="Arial" w:cs="Arial"/>
                                 <w:w w:val="105"/>
-                                <w:sz w:val="24"/>
-                                <w:szCs w:val="24"/>
-                              </w:rPr>
-                              <w:t>Auto Cone Winding Machine</w:t>
+                              </w:rPr>
+                              <w:t>Date</w:t>
+                            </w:r>
+                            <w:r>
+                              <w:rPr>
+                                <w:rFonts w:ascii="Arial" w:hAnsi="Arial" w:cs="Arial"/>
+                                <w:w w:val="105"/>
+                              </w:rPr>
+                              <w:tab/>
+                              <w:t>:</w:t>
                             </w:r>
                           </w:p>
                           <w:p>
@@ -4984,72 +5241,34 @@
                               <w:spacing w:after="0"/>
                               <w:rPr>
                                 <w:rFonts w:ascii="Arial" w:hAnsi="Arial" w:cs="Arial"/>
-                                <w:color w:val="2DBCAC"/>
+                                <w:w w:val="105"/>
                               </w:rPr>
                             </w:pPr>
                             <w:r>
                               <w:rPr>
                                 <w:rFonts w:ascii="Arial" w:hAnsi="Arial" w:cs="Arial"/>
-                                <w:color w:val="2DBCAC"/>
-                              </w:rPr>
-                              <w:t>(09-2021 - 04-2022)</w:t>
+                                <w:w w:val="105"/>
+                              </w:rPr>
+                              <w:t>Place</w:t>
+                            </w:r>
+                            <w:r>
+                              <w:rPr>
+                                <w:rFonts w:ascii="Arial" w:hAnsi="Arial" w:cs="Arial"/>
+                                <w:w w:val="105"/>
+                              </w:rPr>
+                              <w:tab/>
+                              <w:t>:</w:t>
                             </w:r>
                           </w:p>
                           <w:p>
                             <w:pPr>
-                              <w:pStyle w:val="ListParagraph"/>
-                              <w:numPr>
-                                <w:ilvl w:val="0"/>
-                                <w:numId w:val="8"/>
-                              </w:numPr>
                               <w:spacing w:after="0"/>
                               <w:rPr>
-                                <w:rFonts w:ascii="Arial" w:hAnsi="Arial" w:cs="Arial"/>
-                                <w:w w:val="105"/>
-                              </w:rPr>
-                            </w:pPr>
-                            <w:r>
-                              <w:rPr>
-                                <w:rFonts w:ascii="Arial" w:hAnsi="Arial" w:cs="Arial"/>
-                                <w:w w:val="105"/>
-                              </w:rPr>
-                              <w:t xml:space="preserve">It’s a textile machine which winds yarn from cop to large cone automatically, previously it's semi-automatic now we are using stepper motor as robotic arm to make it fully automatic. </w:t>
-                            </w:r>
-                          </w:p>
-                          <w:p>
-                            <w:pPr>
-                              <w:pStyle w:val="ListParagraph"/>
-                              <w:spacing w:after="0"/>
-                              <w:ind w:left="360"/>
-                              <w:rPr>
-                                <w:rFonts w:ascii="Arial" w:hAnsi="Arial" w:cs="Arial"/>
+                                <w:rFonts w:ascii="Arial" w:eastAsia="Times New Roman" w:hAnsi="Arial" w:cs="Arial"/>
                                 <w:b/>
                                 <w:bCs/>
-                                <w:color w:val="2DBCAC"/>
-                              </w:rPr>
-                            </w:pPr>
-                          </w:p>
-                          <w:p>
-                            <w:pPr>
-                              <w:pStyle w:val="ListParagraph"/>
-                              <w:spacing w:after="0"/>
-                              <w:ind w:left="360"/>
-                              <w:rPr>
-                                <w:rFonts w:ascii="Arial" w:hAnsi="Arial" w:cs="Arial"/>
-                                <w:w w:val="105"/>
-                                <w:sz w:val="24"/>
-                                <w:szCs w:val="24"/>
-                              </w:rPr>
-                            </w:pPr>
-                          </w:p>
-                          <w:p>
-                            <w:pPr>
-                              <w:pStyle w:val="ListParagraph"/>
-                              <w:spacing w:after="0"/>
-                              <w:ind w:left="360"/>
-                              <w:rPr>
-                                <w:rFonts w:ascii="Arial" w:hAnsi="Arial" w:cs="Arial"/>
-                                <w:w w:val="105"/>
+                                <w:color w:val="7F7F7F"/>
+                                <w:lang w:val="en-US"/>
                               </w:rPr>
                             </w:pPr>
                           </w:p>
@@ -5072,350 +5291,7 @@
           </mc:Choice>
           <mc:Fallback>
             <w:pict>
-              <v:shape w14:anchorId="537E4130" id="_x0000_s1040" type="#_x0000_t202" style="position:absolute;margin-left:200.4pt;margin-top:.45pt;width:251.6pt;height:202.25pt;z-index:-251630592;visibility:visible;mso-wrap-style:square;mso-width-percent:0;mso-height-percent:0;mso-wrap-distance-left:9pt;mso-wrap-distance-top:3.6pt;mso-wrap-distance-right:9pt;mso-wrap-distance-bottom:3.6pt;mso-position-horizontal:right;mso-position-horizontal-relative:text;mso-position-vertical:absolute;mso-position-vertical-relative:text;mso-width-percent:0;mso-height-percent:0;mso-width-relative:margin;mso-height-relative:margin;v-text-anchor:top" o:gfxdata="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" fillcolor="white [3201]" stroked="f" strokeweight="1.5pt">
-                <v:textbox>
-                  <w:txbxContent>
-                    <w:p>
-                      <w:pPr>
-                        <w:spacing w:after="0"/>
-                        <w:rPr>
-                          <w:rFonts w:ascii="Arial" w:hAnsi="Arial" w:cs="Arial"/>
-                          <w:w w:val="105"/>
-                          <w:sz w:val="24"/>
-                          <w:szCs w:val="24"/>
-                        </w:rPr>
-                      </w:pPr>
-                      <w:r>
-                        <w:rPr>
-                          <w:rFonts w:ascii="Arial" w:hAnsi="Arial" w:cs="Arial"/>
-                          <w:b/>
-                          <w:bCs/>
-                          <w:w w:val="105"/>
-                          <w:sz w:val="24"/>
-                          <w:szCs w:val="24"/>
-                        </w:rPr>
-                        <w:t>Client: Lakshmi Life Sciences Ltd.</w:t>
-                      </w:r>
-                    </w:p>
-                    <w:p>
-                      <w:pPr>
-                        <w:pStyle w:val="ListParagraph"/>
-                        <w:numPr>
-                          <w:ilvl w:val="0"/>
-                          <w:numId w:val="11"/>
-                        </w:numPr>
-                        <w:spacing w:after="0"/>
-                        <w:rPr>
-                          <w:rFonts w:ascii="Arial" w:hAnsi="Arial" w:cs="Arial"/>
-                          <w:w w:val="105"/>
-                          <w:sz w:val="24"/>
-                          <w:szCs w:val="24"/>
-                        </w:rPr>
-                      </w:pPr>
-                      <w:r>
-                        <w:rPr>
-                          <w:rFonts w:ascii="Arial" w:hAnsi="Arial" w:cs="Arial"/>
-                          <w:w w:val="105"/>
-                          <w:sz w:val="24"/>
-                          <w:szCs w:val="24"/>
-                        </w:rPr>
-                        <w:t>Three</w:t>
-                      </w:r>
-                      <w:r>
-                        <w:rPr>
-                          <w:rFonts w:ascii="Arial" w:hAnsi="Arial" w:cs="Arial"/>
-                          <w:w w:val="105"/>
-                          <w:sz w:val="24"/>
-                          <w:szCs w:val="24"/>
-                        </w:rPr>
-                        <w:t xml:space="preserve"> Layer Conveyor system</w:t>
-                      </w:r>
-                    </w:p>
-                    <w:p>
-                      <w:pPr>
-                        <w:spacing w:after="0"/>
-                        <w:rPr>
-                          <w:rFonts w:ascii="Arial" w:hAnsi="Arial" w:cs="Arial"/>
-                          <w:color w:val="2DBCAC"/>
-                        </w:rPr>
-                      </w:pPr>
-                      <w:r>
-                        <w:rPr>
-                          <w:rFonts w:ascii="Arial" w:hAnsi="Arial" w:cs="Arial"/>
-                          <w:color w:val="2DBCAC"/>
-                        </w:rPr>
-                        <w:t>(06-2021 - 09-2021)</w:t>
-                      </w:r>
-                    </w:p>
-                    <w:p>
-                      <w:pPr>
-                        <w:pStyle w:val="ListParagraph"/>
-                        <w:numPr>
-                          <w:ilvl w:val="0"/>
-                          <w:numId w:val="8"/>
-                        </w:numPr>
-                        <w:spacing w:after="0"/>
-                        <w:rPr>
-                          <w:rFonts w:ascii="Arial" w:hAnsi="Arial" w:cs="Arial"/>
-                          <w:w w:val="105"/>
-                        </w:rPr>
-                      </w:pPr>
-                      <w:r>
-                        <w:rPr>
-                          <w:rFonts w:ascii="Arial" w:hAnsi="Arial" w:cs="Arial"/>
-                          <w:w w:val="105"/>
-                        </w:rPr>
-                        <w:t xml:space="preserve">Designed a software prototype model using MAX30100 sensor module to prove the concept, I successfully proved the concept </w:t>
-                      </w:r>
-                    </w:p>
-                    <w:p>
-                      <w:pPr>
-                        <w:pStyle w:val="ListParagraph"/>
-                        <w:numPr>
-                          <w:ilvl w:val="0"/>
-                          <w:numId w:val="11"/>
-                        </w:numPr>
-                        <w:spacing w:after="0"/>
-                        <w:rPr>
-                          <w:rFonts w:ascii="Arial" w:hAnsi="Arial" w:cs="Arial"/>
-                          <w:w w:val="105"/>
-                          <w:sz w:val="24"/>
-                          <w:szCs w:val="24"/>
-                        </w:rPr>
-                      </w:pPr>
-                      <w:r>
-                        <w:rPr>
-                          <w:rFonts w:ascii="Arial" w:hAnsi="Arial" w:cs="Arial"/>
-                          <w:w w:val="105"/>
-                          <w:sz w:val="24"/>
-                          <w:szCs w:val="24"/>
-                        </w:rPr>
-                        <w:t>Auto Cone Winding Machine</w:t>
-                      </w:r>
-                    </w:p>
-                    <w:p>
-                      <w:pPr>
-                        <w:spacing w:after="0"/>
-                        <w:rPr>
-                          <w:rFonts w:ascii="Arial" w:hAnsi="Arial" w:cs="Arial"/>
-                          <w:color w:val="2DBCAC"/>
-                        </w:rPr>
-                      </w:pPr>
-                      <w:r>
-                        <w:rPr>
-                          <w:rFonts w:ascii="Arial" w:hAnsi="Arial" w:cs="Arial"/>
-                          <w:color w:val="2DBCAC"/>
-                        </w:rPr>
-                        <w:t>(09-2021 - 04-2022)</w:t>
-                      </w:r>
-                    </w:p>
-                    <w:p>
-                      <w:pPr>
-                        <w:pStyle w:val="ListParagraph"/>
-                        <w:numPr>
-                          <w:ilvl w:val="0"/>
-                          <w:numId w:val="8"/>
-                        </w:numPr>
-                        <w:spacing w:after="0"/>
-                        <w:rPr>
-                          <w:rFonts w:ascii="Arial" w:hAnsi="Arial" w:cs="Arial"/>
-                          <w:w w:val="105"/>
-                        </w:rPr>
-                      </w:pPr>
-                      <w:r>
-                        <w:rPr>
-                          <w:rFonts w:ascii="Arial" w:hAnsi="Arial" w:cs="Arial"/>
-                          <w:w w:val="105"/>
-                        </w:rPr>
-                        <w:t xml:space="preserve">It’s a textile machine which winds yarn from cop to large cone automatically, previously it's semi-automatic now we are using stepper motor as robotic arm to make it fully automatic. </w:t>
-                      </w:r>
-                    </w:p>
-                    <w:p>
-                      <w:pPr>
-                        <w:pStyle w:val="ListParagraph"/>
-                        <w:spacing w:after="0"/>
-                        <w:ind w:left="360"/>
-                        <w:rPr>
-                          <w:rFonts w:ascii="Arial" w:hAnsi="Arial" w:cs="Arial"/>
-                          <w:b/>
-                          <w:bCs/>
-                          <w:color w:val="2DBCAC"/>
-                        </w:rPr>
-                      </w:pPr>
-                    </w:p>
-                    <w:p>
-                      <w:pPr>
-                        <w:pStyle w:val="ListParagraph"/>
-                        <w:spacing w:after="0"/>
-                        <w:ind w:left="360"/>
-                        <w:rPr>
-                          <w:rFonts w:ascii="Arial" w:hAnsi="Arial" w:cs="Arial"/>
-                          <w:w w:val="105"/>
-                          <w:sz w:val="24"/>
-                          <w:szCs w:val="24"/>
-                        </w:rPr>
-                      </w:pPr>
-                    </w:p>
-                    <w:p>
-                      <w:pPr>
-                        <w:pStyle w:val="ListParagraph"/>
-                        <w:spacing w:after="0"/>
-                        <w:ind w:left="360"/>
-                        <w:rPr>
-                          <w:rFonts w:ascii="Arial" w:hAnsi="Arial" w:cs="Arial"/>
-                          <w:w w:val="105"/>
-                        </w:rPr>
-                      </w:pPr>
-                    </w:p>
-                  </w:txbxContent>
-                </v:textbox>
-              </v:shape>
-            </w:pict>
-          </mc:Fallback>
-        </mc:AlternateContent>
-      </w:r>
-    </w:p>
-    <w:p/>
-    <w:p/>
-    <w:p/>
-    <w:p/>
-    <w:p/>
-    <w:p/>
-    <w:p/>
-    <w:p/>
-    <w:p/>
-    <w:p/>
-    <w:p>
-      <w:r>
-        <w:rPr>
-          <w:rFonts w:ascii="Arial" w:hAnsi="Arial" w:cs="Arial"/>
-          <w:noProof/>
-          <w:lang w:val="en-US"/>
-        </w:rPr>
-        <mc:AlternateContent>
-          <mc:Choice Requires="wps">
-            <w:drawing>
-              <wp:anchor distT="45720" distB="45720" distL="114300" distR="114300" simplePos="0" relativeHeight="251700224" behindDoc="1" locked="0" layoutInCell="1" allowOverlap="1" wp14:anchorId="63840334" wp14:editId="7A97FD2F">
-                <wp:simplePos x="0" y="0"/>
-                <wp:positionH relativeFrom="margin">
-                  <wp:align>left</wp:align>
-                </wp:positionH>
-                <wp:positionV relativeFrom="paragraph">
-                  <wp:posOffset>5632</wp:posOffset>
-                </wp:positionV>
-                <wp:extent cx="755374" cy="495300"/>
-                <wp:effectExtent l="0" t="0" r="6985" b="0"/>
-                <wp:wrapNone/>
-                <wp:docPr id="20" name="Text Box 2"/>
-                <wp:cNvGraphicFramePr>
-                  <a:graphicFrameLocks xmlns:a="http://schemas.openxmlformats.org/drawingml/2006/main"/>
-                </wp:cNvGraphicFramePr>
-                <a:graphic xmlns:a="http://schemas.openxmlformats.org/drawingml/2006/main">
-                  <a:graphicData uri="http://schemas.microsoft.com/office/word/2010/wordprocessingShape">
-                    <wps:wsp>
-                      <wps:cNvSpPr txBox="1">
-                        <a:spLocks noChangeArrowheads="1"/>
-                      </wps:cNvSpPr>
-                      <wps:spPr bwMode="auto">
-                        <a:xfrm>
-                          <a:off x="0" y="0"/>
-                          <a:ext cx="755374" cy="495300"/>
-                        </a:xfrm>
-                        <a:prstGeom prst="rect">
-                          <a:avLst/>
-                        </a:prstGeom>
-                        <a:solidFill>
-                          <a:srgbClr val="FFFFFF"/>
-                        </a:solidFill>
-                        <a:ln w="9525">
-                          <a:noFill/>
-                          <a:miter lim="800000"/>
-                          <a:headEnd/>
-                          <a:tailEnd/>
-                        </a:ln>
-                      </wps:spPr>
-                      <wps:txbx>
-                        <w:txbxContent>
-                          <w:p>
-                            <w:pPr>
-                              <w:spacing w:after="0"/>
-                              <w:rPr>
-                                <w:rFonts w:ascii="Arial" w:hAnsi="Arial" w:cs="Arial"/>
-                                <w:w w:val="105"/>
-                              </w:rPr>
-                            </w:pPr>
-                            <w:r>
-                              <w:rPr>
-                                <w:rFonts w:ascii="Arial" w:hAnsi="Arial" w:cs="Arial"/>
-                                <w:w w:val="105"/>
-                              </w:rPr>
-                              <w:t>Date</w:t>
-                            </w:r>
-                            <w:r>
-                              <w:rPr>
-                                <w:rFonts w:ascii="Arial" w:hAnsi="Arial" w:cs="Arial"/>
-                                <w:w w:val="105"/>
-                              </w:rPr>
-                              <w:tab/>
-                              <w:t>:</w:t>
-                            </w:r>
-                          </w:p>
-                          <w:p>
-                            <w:pPr>
-                              <w:spacing w:after="0"/>
-                              <w:rPr>
-                                <w:rFonts w:ascii="Arial" w:hAnsi="Arial" w:cs="Arial"/>
-                                <w:w w:val="105"/>
-                              </w:rPr>
-                            </w:pPr>
-                            <w:r>
-                              <w:rPr>
-                                <w:rFonts w:ascii="Arial" w:hAnsi="Arial" w:cs="Arial"/>
-                                <w:w w:val="105"/>
-                              </w:rPr>
-                              <w:t>Place</w:t>
-                            </w:r>
-                            <w:r>
-                              <w:rPr>
-                                <w:rFonts w:ascii="Arial" w:hAnsi="Arial" w:cs="Arial"/>
-                                <w:w w:val="105"/>
-                              </w:rPr>
-                              <w:tab/>
-                              <w:t>:</w:t>
-                            </w:r>
-                          </w:p>
-                          <w:p>
-                            <w:pPr>
-                              <w:spacing w:after="0"/>
-                              <w:rPr>
-                                <w:rFonts w:ascii="Arial" w:eastAsia="Times New Roman" w:hAnsi="Arial" w:cs="Arial"/>
-                                <w:b/>
-                                <w:bCs/>
-                                <w:color w:val="7F7F7F"/>
-                                <w:lang w:val="en-US"/>
-                              </w:rPr>
-                            </w:pPr>
-                          </w:p>
-                        </w:txbxContent>
-                      </wps:txbx>
-                      <wps:bodyPr rot="0" vert="horz" wrap="square" lIns="91440" tIns="45720" rIns="91440" bIns="45720" anchor="t" anchorCtr="0">
-                        <a:noAutofit/>
-                      </wps:bodyPr>
-                    </wps:wsp>
-                  </a:graphicData>
-                </a:graphic>
-                <wp14:sizeRelH relativeFrom="margin">
-                  <wp14:pctWidth>0</wp14:pctWidth>
-                </wp14:sizeRelH>
-                <wp14:sizeRelV relativeFrom="margin">
-                  <wp14:pctHeight>0</wp14:pctHeight>
-                </wp14:sizeRelV>
-              </wp:anchor>
-            </w:drawing>
-          </mc:Choice>
-          <mc:Fallback>
-            <w:pict>
-              <v:shape w14:anchorId="63840334" id="_x0000_s1041" type="#_x0000_t202" style="position:absolute;margin-left:0;margin-top:.45pt;width:59.5pt;height:39pt;z-index:-251616256;visibility:visible;mso-wrap-style:square;mso-width-percent:0;mso-height-percent:0;mso-wrap-distance-left:9pt;mso-wrap-distance-top:3.6pt;mso-wrap-distance-right:9pt;mso-wrap-distance-bottom:3.6pt;mso-position-horizontal:left;mso-position-horizontal-relative:margin;mso-position-vertical:absolute;mso-position-vertical-relative:text;mso-width-percent:0;mso-height-percent:0;mso-width-relative:margin;mso-height-relative:margin;v-text-anchor:top" o:gfxdata="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" stroked="f">
+              <v:shape w14:anchorId="63840334" id="_x0000_s1041" type="#_x0000_t202" style="position:absolute;margin-left:0;margin-top:1pt;width:59.45pt;height:39pt;z-index:-251619328;visibility:visible;mso-wrap-style:square;mso-width-percent:0;mso-height-percent:0;mso-wrap-distance-left:9pt;mso-wrap-distance-top:3.6pt;mso-wrap-distance-right:9pt;mso-wrap-distance-bottom:3.6pt;mso-position-horizontal:left;mso-position-horizontal-relative:margin;mso-position-vertical:absolute;mso-position-vertical-relative:text;mso-width-percent:0;mso-height-percent:0;mso-width-relative:margin;mso-height-relative:margin;v-text-anchor:top" o:gfxdata="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" stroked="f">
                 <v:textbox>
                   <w:txbxContent>
                     <w:p>
@@ -5497,7 +5373,7 @@
         <mc:AlternateContent>
           <mc:Choice Requires="wps">
             <w:drawing>
-              <wp:anchor distT="0" distB="0" distL="114300" distR="114300" simplePos="0" relativeHeight="251698176" behindDoc="1" locked="0" layoutInCell="1" allowOverlap="1" wp14:anchorId="082D1F4C" wp14:editId="7C844D57">
+              <wp:anchor distT="0" distB="0" distL="114300" distR="114300" simplePos="0" relativeHeight="251695104" behindDoc="1" locked="0" layoutInCell="1" allowOverlap="1" wp14:anchorId="082D1F4C" wp14:editId="69056895">
                 <wp:simplePos x="0" y="0"/>
                 <wp:positionH relativeFrom="margin">
                   <wp:align>left</wp:align>
@@ -5552,7 +5428,7 @@
           </mc:Choice>
           <mc:Fallback>
             <w:pict>
-              <v:line w14:anchorId="0F1BC130" id="Straight Connector 863010779" o:spid="_x0000_s1026" style="position:absolute;flip:y;z-index:-251618304;visibility:visible;mso-wrap-style:square;mso-width-percent:0;mso-height-percent:0;mso-wrap-distance-left:9pt;mso-wrap-distance-top:0;mso-wrap-distance-right:9pt;mso-wrap-distance-bottom:0;mso-position-horizontal:left;mso-position-horizontal-relative:margin;mso-position-vertical:absolute;mso-position-vertical-relative:text;mso-width-percent:0;mso-height-percent:0;mso-width-relative:margin;mso-height-relative:margin" from="0,21.85pt" to="550.9pt,23.6pt" o:gfxdata="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" strokecolor="#156082 [3204]" strokeweight="1pt">
+              <v:line w14:anchorId="71151A10" id="Straight Connector 863010779" o:spid="_x0000_s1026" style="position:absolute;flip:y;z-index:-251621376;visibility:visible;mso-wrap-style:square;mso-width-percent:0;mso-height-percent:0;mso-wrap-distance-left:9pt;mso-wrap-distance-top:0;mso-wrap-distance-right:9pt;mso-wrap-distance-bottom:0;mso-position-horizontal:left;mso-position-horizontal-relative:margin;mso-position-vertical:absolute;mso-position-vertical-relative:text;mso-width-percent:0;mso-height-percent:0;mso-width-relative:margin;mso-height-relative:margin" from="0,21.85pt" to="550.9pt,23.6pt" o:gfxdata="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" strokecolor="#156082 [3204]" strokeweight="1pt">
                 <v:stroke joinstyle="miter"/>
                 <w10:wrap anchorx="margin"/>
               </v:line>
@@ -5561,7 +5437,6 @@
         </mc:AlternateContent>
       </w:r>
     </w:p>
-    <w:p/>
     <w:p/>
     <w:p>
       <w:r>
@@ -5573,16 +5448,16 @@
         <mc:AlternateContent>
           <mc:Choice Requires="wps">
             <w:drawing>
-              <wp:anchor distT="45720" distB="45720" distL="114300" distR="114300" simplePos="0" relativeHeight="251687936" behindDoc="1" locked="0" layoutInCell="1" allowOverlap="1" wp14:anchorId="2566CD09" wp14:editId="3CA93115">
+              <wp:anchor distT="45720" distB="45720" distL="114300" distR="114300" simplePos="0" relativeHeight="251684864" behindDoc="1" locked="0" layoutInCell="1" allowOverlap="1" wp14:anchorId="2566CD09" wp14:editId="2AA5524C">
                 <wp:simplePos x="0" y="0"/>
                 <wp:positionH relativeFrom="margin">
                   <wp:align>right</wp:align>
                 </wp:positionH>
                 <wp:positionV relativeFrom="paragraph">
-                  <wp:posOffset>195801</wp:posOffset>
+                  <wp:posOffset>146050</wp:posOffset>
                 </wp:positionV>
-                <wp:extent cx="3188059" cy="1216549"/>
-                <wp:effectExtent l="0" t="0" r="0" b="3175"/>
+                <wp:extent cx="3203575" cy="3169920"/>
+                <wp:effectExtent l="0" t="0" r="0" b="0"/>
                 <wp:wrapNone/>
                 <wp:docPr id="1720114837" name="Text Box 2"/>
                 <wp:cNvGraphicFramePr>
@@ -5597,7 +5472,7 @@
                       <wps:spPr bwMode="auto">
                         <a:xfrm>
                           <a:off x="0" y="0"/>
-                          <a:ext cx="3188059" cy="1216549"/>
+                          <a:ext cx="3203575" cy="3169920"/>
                         </a:xfrm>
                         <a:prstGeom prst="rect">
                           <a:avLst/>
@@ -5629,6 +5504,77 @@
                               <w:pStyle w:val="ListParagraph"/>
                               <w:numPr>
                                 <w:ilvl w:val="0"/>
+                                <w:numId w:val="11"/>
+                              </w:numPr>
+                              <w:spacing w:after="0"/>
+                              <w:rPr>
+                                <w:rFonts w:ascii="Arial" w:hAnsi="Arial" w:cs="Arial"/>
+                                <w:w w:val="105"/>
+                                <w:sz w:val="24"/>
+                                <w:szCs w:val="24"/>
+                              </w:rPr>
+                            </w:pPr>
+                            <w:r>
+                              <w:rPr>
+                                <w:rFonts w:ascii="Arial" w:hAnsi="Arial" w:cs="Arial"/>
+                                <w:w w:val="105"/>
+                                <w:sz w:val="24"/>
+                                <w:szCs w:val="24"/>
+                              </w:rPr>
+                              <w:t>Auto Cone Winding Machine</w:t>
+                            </w:r>
+                          </w:p>
+                          <w:p>
+                            <w:pPr>
+                              <w:spacing w:after="0"/>
+                              <w:ind w:left="360"/>
+                              <w:rPr>
+                                <w:rFonts w:ascii="Arial" w:hAnsi="Arial" w:cs="Arial"/>
+                                <w:color w:val="2DBCAC"/>
+                              </w:rPr>
+                            </w:pPr>
+                            <w:r>
+                              <w:rPr>
+                                <w:rFonts w:ascii="Arial" w:hAnsi="Arial" w:cs="Arial"/>
+                                <w:color w:val="2DBCAC"/>
+                              </w:rPr>
+                              <w:t>(09-2021 - 04-2022)</w:t>
+                            </w:r>
+                          </w:p>
+                          <w:p>
+                            <w:pPr>
+                              <w:pStyle w:val="ListParagraph"/>
+                              <w:numPr>
+                                <w:ilvl w:val="0"/>
+                                <w:numId w:val="19"/>
+                              </w:numPr>
+                              <w:spacing w:after="0"/>
+                              <w:rPr>
+                                <w:rFonts w:ascii="Arial" w:hAnsi="Arial" w:cs="Arial"/>
+                                <w:w w:val="105"/>
+                                <w:lang w:val="en-US"/>
+                              </w:rPr>
+                            </w:pPr>
+                            <w:r>
+                              <w:rPr>
+                                <w:rFonts w:ascii="Arial" w:hAnsi="Arial" w:cs="Arial"/>
+                                <w:w w:val="105"/>
+                                <w:lang w:val="en-US"/>
+                              </w:rPr>
+                              <w:t>Contributed to the development of an Automatic Cone Winding Machine by implementing embedded firmware and stepper motor control for robotic yarn handling, enabling the transition from semi-automatic to fully automated operation.</w:t>
+                            </w:r>
+                          </w:p>
+                          <w:p>
+                            <w:pPr>
+                              <w:spacing w:after="0"/>
+                              <w:ind w:left="360" w:hanging="360"/>
+                            </w:pPr>
+                          </w:p>
+                          <w:p>
+                            <w:pPr>
+                              <w:pStyle w:val="ListParagraph"/>
+                              <w:numPr>
+                                <w:ilvl w:val="0"/>
                                 <w:numId w:val="13"/>
                               </w:numPr>
                               <w:spacing w:after="0"/>
@@ -5659,6 +5605,13 @@
                                 <w:color w:val="2DBCAC"/>
                               </w:rPr>
                             </w:pPr>
+                            <w:r>
+                              <w:rPr>
+                                <w:rFonts w:ascii="Arial" w:hAnsi="Arial" w:cs="Arial"/>
+                                <w:color w:val="2DBCAC"/>
+                              </w:rPr>
+                              <w:t xml:space="preserve"> </w:t>
+                            </w:r>
                             <w:r>
                               <w:rPr>
                                 <w:rFonts w:ascii="Arial" w:hAnsi="Arial" w:cs="Arial"/>
@@ -5685,7 +5638,7 @@
                                 <w:rFonts w:ascii="Arial" w:hAnsi="Arial" w:cs="Arial"/>
                                 <w:w w:val="105"/>
                               </w:rPr>
-                              <w:t xml:space="preserve">Designed a software prototype model using MAX30100 sensor module to prove the concept, I successfully proved the concept </w:t>
+                              <w:t>Developed a software prototype using the MAX30100 sensor module and successfully demonstrated proof-of-concept through integration and functional validation.</w:t>
                             </w:r>
                           </w:p>
                         </w:txbxContent>
@@ -5707,9 +5660,80 @@
           </mc:Choice>
           <mc:Fallback>
             <w:pict>
-              <v:shape w14:anchorId="2566CD09" id="_x0000_s1042" type="#_x0000_t202" style="position:absolute;margin-left:199.85pt;margin-top:15.4pt;width:251.05pt;height:95.8pt;z-index:-251628544;visibility:visible;mso-wrap-style:square;mso-width-percent:0;mso-height-percent:0;mso-wrap-distance-left:9pt;mso-wrap-distance-top:3.6pt;mso-wrap-distance-right:9pt;mso-wrap-distance-bottom:3.6pt;mso-position-horizontal:right;mso-position-horizontal-relative:margin;mso-position-vertical:absolute;mso-position-vertical-relative:text;mso-width-percent:0;mso-height-percent:0;mso-width-relative:margin;mso-height-relative:margin;v-text-anchor:top" o:gfxdata="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" fillcolor="white [3201]" stroked="f" strokeweight="1.5pt">
+              <v:shape w14:anchorId="2566CD09" id="_x0000_s1042" type="#_x0000_t202" style="position:absolute;margin-left:201.05pt;margin-top:11.5pt;width:252.25pt;height:249.6pt;z-index:-251631616;visibility:visible;mso-wrap-style:square;mso-width-percent:0;mso-height-percent:0;mso-wrap-distance-left:9pt;mso-wrap-distance-top:3.6pt;mso-wrap-distance-right:9pt;mso-wrap-distance-bottom:3.6pt;mso-position-horizontal:right;mso-position-horizontal-relative:margin;mso-position-vertical:absolute;mso-position-vertical-relative:text;mso-width-percent:0;mso-height-percent:0;mso-width-relative:margin;mso-height-relative:margin;v-text-anchor:top" o:gfxdata="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" fillcolor="white [3201]" stroked="f" strokeweight="1.5pt">
                 <v:textbox>
                   <w:txbxContent>
+                    <w:p>
+                      <w:pPr>
+                        <w:pStyle w:val="ListParagraph"/>
+                        <w:numPr>
+                          <w:ilvl w:val="0"/>
+                          <w:numId w:val="11"/>
+                        </w:numPr>
+                        <w:spacing w:after="0"/>
+                        <w:rPr>
+                          <w:rFonts w:ascii="Arial" w:hAnsi="Arial" w:cs="Arial"/>
+                          <w:w w:val="105"/>
+                          <w:sz w:val="24"/>
+                          <w:szCs w:val="24"/>
+                        </w:rPr>
+                      </w:pPr>
+                      <w:r>
+                        <w:rPr>
+                          <w:rFonts w:ascii="Arial" w:hAnsi="Arial" w:cs="Arial"/>
+                          <w:w w:val="105"/>
+                          <w:sz w:val="24"/>
+                          <w:szCs w:val="24"/>
+                        </w:rPr>
+                        <w:t>Auto Cone Winding Machine</w:t>
+                      </w:r>
+                    </w:p>
+                    <w:p>
+                      <w:pPr>
+                        <w:spacing w:after="0"/>
+                        <w:ind w:left="360"/>
+                        <w:rPr>
+                          <w:rFonts w:ascii="Arial" w:hAnsi="Arial" w:cs="Arial"/>
+                          <w:color w:val="2DBCAC"/>
+                        </w:rPr>
+                      </w:pPr>
+                      <w:r>
+                        <w:rPr>
+                          <w:rFonts w:ascii="Arial" w:hAnsi="Arial" w:cs="Arial"/>
+                          <w:color w:val="2DBCAC"/>
+                        </w:rPr>
+                        <w:t>(09-2021 - 04-2022)</w:t>
+                      </w:r>
+                    </w:p>
+                    <w:p>
+                      <w:pPr>
+                        <w:pStyle w:val="ListParagraph"/>
+                        <w:numPr>
+                          <w:ilvl w:val="0"/>
+                          <w:numId w:val="19"/>
+                        </w:numPr>
+                        <w:spacing w:after="0"/>
+                        <w:rPr>
+                          <w:rFonts w:ascii="Arial" w:hAnsi="Arial" w:cs="Arial"/>
+                          <w:w w:val="105"/>
+                          <w:lang w:val="en-US"/>
+                        </w:rPr>
+                      </w:pPr>
+                      <w:r>
+                        <w:rPr>
+                          <w:rFonts w:ascii="Arial" w:hAnsi="Arial" w:cs="Arial"/>
+                          <w:w w:val="105"/>
+                          <w:lang w:val="en-US"/>
+                        </w:rPr>
+                        <w:t>Contributed to the development of an Automatic Cone Winding Machine by implementing embedded firmware and stepper motor control for robotic yarn handling, enabling the transition from semi-automatic to fully automated operation.</w:t>
+                      </w:r>
+                    </w:p>
+                    <w:p>
+                      <w:pPr>
+                        <w:spacing w:after="0"/>
+                        <w:ind w:left="360" w:hanging="360"/>
+                      </w:pPr>
+                    </w:p>
                     <w:p>
                       <w:pPr>
                         <w:pStyle w:val="ListParagraph"/>
@@ -5745,6 +5769,13 @@
                           <w:color w:val="2DBCAC"/>
                         </w:rPr>
                       </w:pPr>
+                      <w:r>
+                        <w:rPr>
+                          <w:rFonts w:ascii="Arial" w:hAnsi="Arial" w:cs="Arial"/>
+                          <w:color w:val="2DBCAC"/>
+                        </w:rPr>
+                        <w:t xml:space="preserve"> </w:t>
+                      </w:r>
                       <w:r>
                         <w:rPr>
                           <w:rFonts w:ascii="Arial" w:hAnsi="Arial" w:cs="Arial"/>
@@ -5771,7 +5802,7 @@
                           <w:rFonts w:ascii="Arial" w:hAnsi="Arial" w:cs="Arial"/>
                           <w:w w:val="105"/>
                         </w:rPr>
-                        <w:t xml:space="preserve">Designed a software prototype model using MAX30100 sensor module to prove the concept, I successfully proved the concept </w:t>
+                        <w:t>Developed a software prototype using the MAX30100 sensor module and successfully demonstrated proof-of-concept through integration and functional validation.</w:t>
                       </w:r>
                     </w:p>
                   </w:txbxContent>
@@ -5786,6 +5817,18 @@
     <w:p/>
     <w:p/>
     <w:p/>
+    <w:p/>
+    <w:p/>
+    <w:p/>
+    <w:p/>
+    <w:p/>
+    <w:p/>
+    <w:p/>
+    <w:p>
+      <w:r>
+        <w:t xml:space="preserve"> </w:t>
+      </w:r>
+    </w:p>
     <w:p>
       <w:r>
         <w:rPr>
@@ -5795,18 +5838,18 @@
         <mc:AlternateContent>
           <mc:Choice Requires="wpg">
             <w:drawing>
-              <wp:anchor distT="0" distB="0" distL="114300" distR="114300" simplePos="0" relativeHeight="251709440" behindDoc="1" locked="0" layoutInCell="1" allowOverlap="1" wp14:anchorId="7E379D59" wp14:editId="26118EAE">
+              <wp:anchor distT="0" distB="0" distL="114300" distR="114300" simplePos="0" relativeHeight="251709440" behindDoc="1" locked="0" layoutInCell="1" allowOverlap="1" wp14:anchorId="68ACF9AE" wp14:editId="10A093B8">
                 <wp:simplePos x="0" y="0"/>
                 <wp:positionH relativeFrom="margin">
                   <wp:align>right</wp:align>
                 </wp:positionH>
                 <wp:positionV relativeFrom="paragraph">
-                  <wp:posOffset>268495</wp:posOffset>
+                  <wp:posOffset>5080</wp:posOffset>
                 </wp:positionV>
                 <wp:extent cx="3203575" cy="1301750"/>
                 <wp:effectExtent l="0" t="0" r="0" b="0"/>
                 <wp:wrapNone/>
-                <wp:docPr id="1209431269" name="Group 17"/>
+                <wp:docPr id="917463339" name="Group 1"/>
                 <wp:cNvGraphicFramePr/>
                 <a:graphic xmlns:a="http://schemas.openxmlformats.org/drawingml/2006/main">
                   <a:graphicData uri="http://schemas.microsoft.com/office/word/2010/wordprocessingGroup">
@@ -5857,7 +5900,6 @@
                           <w:txbxContent>
                             <w:p>
                               <w:pPr>
-                                <w:pStyle w:val="ListParagraph"/>
                                 <w:spacing w:before="179" w:line="240" w:lineRule="auto"/>
                                 <w:ind w:right="128"/>
                                 <w:rPr>
@@ -5880,7 +5922,7 @@
                                   <w:szCs w:val="28"/>
                                   <w:lang w:val="en-US"/>
                                 </w:rPr>
-                                <w:t>CERTIFICATIONS AND</w:t>
+                                <w:t xml:space="preserve">    </w:t>
                               </w:r>
                               <w:r>
                                 <w:rPr>
@@ -5892,57 +5934,7 @@
                                   <w:szCs w:val="28"/>
                                   <w:lang w:val="en-US"/>
                                 </w:rPr>
-                                <w:t xml:space="preserve"> </w:t>
-                              </w:r>
-                              <w:r>
-                                <w:rPr>
-                                  <w:rFonts w:ascii="Arial" w:hAnsi="Arial" w:cs="Arial"/>
-                                  <w:b/>
-                                  <w:bCs/>
-                                  <w:color w:val="2DBCAC"/>
-                                  <w:sz w:val="28"/>
-                                  <w:szCs w:val="28"/>
-                                  <w:lang w:val="en-US"/>
-                                </w:rPr>
                                 <w:t>TRAININGS</w:t>
-                              </w:r>
-                            </w:p>
-                            <w:p>
-                              <w:pPr>
-                                <w:pStyle w:val="ListParagraph"/>
-                                <w:spacing w:before="179" w:line="240" w:lineRule="auto"/>
-                                <w:ind w:right="128"/>
-                                <w:rPr>
-                                  <w:rFonts w:ascii="Arial" w:hAnsi="Arial" w:cs="Arial"/>
-                                  <w:b/>
-                                  <w:bCs/>
-                                  <w:color w:val="2DBCAC"/>
-                                  <w:sz w:val="28"/>
-                                  <w:szCs w:val="28"/>
-                                  <w:lang w:val="en-US"/>
-                                </w:rPr>
-                              </w:pPr>
-                            </w:p>
-                            <w:p>
-                              <w:pPr>
-                                <w:pStyle w:val="ListParagraph"/>
-                                <w:numPr>
-                                  <w:ilvl w:val="0"/>
-                                  <w:numId w:val="15"/>
-                                </w:numPr>
-                                <w:spacing w:before="179" w:line="240" w:lineRule="auto"/>
-                                <w:ind w:right="128"/>
-                                <w:rPr>
-                                  <w:rFonts w:ascii="Arial" w:hAnsi="Arial" w:cs="Arial"/>
-                                  <w:w w:val="105"/>
-                                </w:rPr>
-                              </w:pPr>
-                              <w:r>
-                                <w:rPr>
-                                  <w:rFonts w:ascii="Arial" w:hAnsi="Arial" w:cs="Arial"/>
-                                  <w:w w:val="105"/>
-                                </w:rPr>
-                                <w:t>Embedded Linux Training</w:t>
                               </w:r>
                             </w:p>
                             <w:p>
@@ -5964,8 +5956,69 @@
                                   <w:rFonts w:ascii="Arial" w:hAnsi="Arial" w:cs="Arial"/>
                                   <w:w w:val="105"/>
                                 </w:rPr>
-                                <w:t>Zephyr RTOS Training</w:t>
+                                <w:t xml:space="preserve">Embedded Linux </w:t>
                               </w:r>
+                              <w:r>
+                                <w:rPr>
+                                  <w:rFonts w:ascii="Arial" w:hAnsi="Arial" w:cs="Arial"/>
+                                  <w:w w:val="105"/>
+                                </w:rPr>
+                                <w:t>system programming</w:t>
+                              </w:r>
+                            </w:p>
+                            <w:p>
+                              <w:pPr>
+                                <w:pStyle w:val="ListParagraph"/>
+                                <w:numPr>
+                                  <w:ilvl w:val="0"/>
+                                  <w:numId w:val="15"/>
+                                </w:numPr>
+                                <w:spacing w:before="179" w:line="240" w:lineRule="auto"/>
+                                <w:ind w:right="128"/>
+                                <w:rPr>
+                                  <w:rFonts w:ascii="Arial" w:hAnsi="Arial" w:cs="Arial"/>
+                                  <w:w w:val="105"/>
+                                </w:rPr>
+                              </w:pPr>
+                              <w:r>
+                                <w:rPr>
+                                  <w:rFonts w:ascii="Arial" w:hAnsi="Arial" w:cs="Arial"/>
+                                  <w:w w:val="105"/>
+                                </w:rPr>
+                                <w:t>Zephyr RTOS</w:t>
+                              </w:r>
+                            </w:p>
+                            <w:p>
+                              <w:pPr>
+                                <w:pStyle w:val="ListParagraph"/>
+                                <w:numPr>
+                                  <w:ilvl w:val="0"/>
+                                  <w:numId w:val="15"/>
+                                </w:numPr>
+                                <w:spacing w:before="179" w:line="240" w:lineRule="auto"/>
+                                <w:ind w:right="128"/>
+                                <w:rPr>
+                                  <w:rFonts w:ascii="Arial" w:hAnsi="Arial" w:cs="Arial"/>
+                                  <w:w w:val="105"/>
+                                </w:rPr>
+                              </w:pPr>
+                              <w:r>
+                                <w:rPr>
+                                  <w:rFonts w:ascii="Arial" w:hAnsi="Arial" w:cs="Arial"/>
+                                  <w:w w:val="105"/>
+                                </w:rPr>
+                                <w:t>Linux Boot flow</w:t>
+                              </w:r>
+                            </w:p>
+                            <w:p>
+                              <w:pPr>
+                                <w:spacing w:before="179" w:line="240" w:lineRule="auto"/>
+                                <w:ind w:right="128"/>
+                                <w:rPr>
+                                  <w:rFonts w:ascii="Arial" w:hAnsi="Arial" w:cs="Arial"/>
+                                  <w:w w:val="105"/>
+                                </w:rPr>
+                              </w:pPr>
                             </w:p>
                             <w:p>
                               <w:pPr>
@@ -6032,7 +6085,7 @@
                         </pic:blipFill>
                         <pic:spPr bwMode="auto">
                           <a:xfrm>
-                            <a:off x="246491" y="206734"/>
+                            <a:off x="0" y="160020"/>
                             <a:ext cx="292100" cy="292100"/>
                           </a:xfrm>
                           <a:prstGeom prst="rect">
@@ -6052,13 +6105,12 @@
           </mc:Choice>
           <mc:Fallback>
             <w:pict>
-              <v:group w14:anchorId="7E379D59" id="Group 17" o:spid="_x0000_s1043" style="position:absolute;margin-left:201.05pt;margin-top:21.15pt;width:252.25pt;height:102.5pt;z-index:-251607040;mso-position-horizontal:right;mso-position-horizontal-relative:margin" coordsize="32035,13017" o:gfxdata="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">
+              <v:group w14:anchorId="68ACF9AE" id="Group 1" o:spid="_x0000_s1043" style="position:absolute;margin-left:201.05pt;margin-top:.4pt;width:252.25pt;height:102.5pt;z-index:-251607040;mso-position-horizontal:right;mso-position-horizontal-relative:margin" coordsize="32035,13017" o:gfxdata="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">
                 <v:shape id="_x0000_s1044" type="#_x0000_t202" style="position:absolute;width:32035;height:13017;visibility:visible;mso-wrap-style:square;v-text-anchor:top" o:gfxdata="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" fillcolor="white [3201]" stroked="f" strokeweight="1.5pt">
                   <v:textbox>
                     <w:txbxContent>
                       <w:p>
                         <w:pPr>
-                          <w:pStyle w:val="ListParagraph"/>
                           <w:spacing w:before="179" w:line="240" w:lineRule="auto"/>
                           <w:ind w:right="128"/>
                           <w:rPr>
@@ -6081,7 +6133,7 @@
                             <w:szCs w:val="28"/>
                             <w:lang w:val="en-US"/>
                           </w:rPr>
-                          <w:t>CERTIFICATIONS AND</w:t>
+                          <w:t xml:space="preserve">    </w:t>
                         </w:r>
                         <w:r>
                           <w:rPr>
@@ -6093,57 +6145,7 @@
                             <w:szCs w:val="28"/>
                             <w:lang w:val="en-US"/>
                           </w:rPr>
-                          <w:t xml:space="preserve"> </w:t>
-                        </w:r>
-                        <w:r>
-                          <w:rPr>
-                            <w:rFonts w:ascii="Arial" w:hAnsi="Arial" w:cs="Arial"/>
-                            <w:b/>
-                            <w:bCs/>
-                            <w:color w:val="2DBCAC"/>
-                            <w:sz w:val="28"/>
-                            <w:szCs w:val="28"/>
-                            <w:lang w:val="en-US"/>
-                          </w:rPr>
                           <w:t>TRAININGS</w:t>
-                        </w:r>
-                      </w:p>
-                      <w:p>
-                        <w:pPr>
-                          <w:pStyle w:val="ListParagraph"/>
-                          <w:spacing w:before="179" w:line="240" w:lineRule="auto"/>
-                          <w:ind w:right="128"/>
-                          <w:rPr>
-                            <w:rFonts w:ascii="Arial" w:hAnsi="Arial" w:cs="Arial"/>
-                            <w:b/>
-                            <w:bCs/>
-                            <w:color w:val="2DBCAC"/>
-                            <w:sz w:val="28"/>
-                            <w:szCs w:val="28"/>
-                            <w:lang w:val="en-US"/>
-                          </w:rPr>
-                        </w:pPr>
-                      </w:p>
-                      <w:p>
-                        <w:pPr>
-                          <w:pStyle w:val="ListParagraph"/>
-                          <w:numPr>
-                            <w:ilvl w:val="0"/>
-                            <w:numId w:val="15"/>
-                          </w:numPr>
-                          <w:spacing w:before="179" w:line="240" w:lineRule="auto"/>
-                          <w:ind w:right="128"/>
-                          <w:rPr>
-                            <w:rFonts w:ascii="Arial" w:hAnsi="Arial" w:cs="Arial"/>
-                            <w:w w:val="105"/>
-                          </w:rPr>
-                        </w:pPr>
-                        <w:r>
-                          <w:rPr>
-                            <w:rFonts w:ascii="Arial" w:hAnsi="Arial" w:cs="Arial"/>
-                            <w:w w:val="105"/>
-                          </w:rPr>
-                          <w:t>Embedded Linux Training</w:t>
                         </w:r>
                       </w:p>
                       <w:p>
@@ -6165,19 +6167,67 @@
                             <w:rFonts w:ascii="Arial" w:hAnsi="Arial" w:cs="Arial"/>
                             <w:w w:val="105"/>
                           </w:rPr>
-                          <w:t>Zephyr RTOS Training</w:t>
+                          <w:t xml:space="preserve">Embedded Linux </w:t>
+                        </w:r>
+                        <w:r>
+                          <w:rPr>
+                            <w:rFonts w:ascii="Arial" w:hAnsi="Arial" w:cs="Arial"/>
+                            <w:w w:val="105"/>
+                          </w:rPr>
+                          <w:t>system programming</w:t>
                         </w:r>
                       </w:p>
                       <w:p>
                         <w:pPr>
                           <w:pStyle w:val="ListParagraph"/>
-                          <w:spacing w:after="0"/>
-                          <w:ind w:left="360"/>
-                          <w:rPr>
-                            <w:rFonts w:ascii="Arial" w:hAnsi="Arial" w:cs="Arial"/>
-                            <w:b/>
-                            <w:bCs/>
-                            <w:color w:val="2DBCAC"/>
+                          <w:numPr>
+                            <w:ilvl w:val="0"/>
+                            <w:numId w:val="15"/>
+                          </w:numPr>
+                          <w:spacing w:before="179" w:line="240" w:lineRule="auto"/>
+                          <w:ind w:right="128"/>
+                          <w:rPr>
+                            <w:rFonts w:ascii="Arial" w:hAnsi="Arial" w:cs="Arial"/>
+                            <w:w w:val="105"/>
+                          </w:rPr>
+                        </w:pPr>
+                        <w:r>
+                          <w:rPr>
+                            <w:rFonts w:ascii="Arial" w:hAnsi="Arial" w:cs="Arial"/>
+                            <w:w w:val="105"/>
+                          </w:rPr>
+                          <w:t>Zephyr RTOS</w:t>
+                        </w:r>
+                      </w:p>
+                      <w:p>
+                        <w:pPr>
+                          <w:pStyle w:val="ListParagraph"/>
+                          <w:numPr>
+                            <w:ilvl w:val="0"/>
+                            <w:numId w:val="15"/>
+                          </w:numPr>
+                          <w:spacing w:before="179" w:line="240" w:lineRule="auto"/>
+                          <w:ind w:right="128"/>
+                          <w:rPr>
+                            <w:rFonts w:ascii="Arial" w:hAnsi="Arial" w:cs="Arial"/>
+                            <w:w w:val="105"/>
+                          </w:rPr>
+                        </w:pPr>
+                        <w:r>
+                          <w:rPr>
+                            <w:rFonts w:ascii="Arial" w:hAnsi="Arial" w:cs="Arial"/>
+                            <w:w w:val="105"/>
+                          </w:rPr>
+                          <w:t>Linux Boot flow</w:t>
+                        </w:r>
+                      </w:p>
+                      <w:p>
+                        <w:pPr>
+                          <w:spacing w:before="179" w:line="240" w:lineRule="auto"/>
+                          <w:ind w:right="128"/>
+                          <w:rPr>
+                            <w:rFonts w:ascii="Arial" w:hAnsi="Arial" w:cs="Arial"/>
+                            <w:w w:val="105"/>
                           </w:rPr>
                         </w:pPr>
                       </w:p>
@@ -6188,9 +6238,9 @@
                           <w:ind w:left="360"/>
                           <w:rPr>
                             <w:rFonts w:ascii="Arial" w:hAnsi="Arial" w:cs="Arial"/>
-                            <w:w w:val="105"/>
-                            <w:sz w:val="24"/>
-                            <w:szCs w:val="24"/>
+                            <w:b/>
+                            <w:bCs/>
+                            <w:color w:val="2DBCAC"/>
                           </w:rPr>
                         </w:pPr>
                       </w:p>
@@ -6202,13 +6252,26 @@
                           <w:rPr>
                             <w:rFonts w:ascii="Arial" w:hAnsi="Arial" w:cs="Arial"/>
                             <w:w w:val="105"/>
+                            <w:sz w:val="24"/>
+                            <w:szCs w:val="24"/>
+                          </w:rPr>
+                        </w:pPr>
+                      </w:p>
+                      <w:p>
+                        <w:pPr>
+                          <w:pStyle w:val="ListParagraph"/>
+                          <w:spacing w:after="0"/>
+                          <w:ind w:left="360"/>
+                          <w:rPr>
+                            <w:rFonts w:ascii="Arial" w:hAnsi="Arial" w:cs="Arial"/>
+                            <w:w w:val="105"/>
                           </w:rPr>
                         </w:pPr>
                       </w:p>
                     </w:txbxContent>
                   </v:textbox>
                 </v:shape>
-                <v:shape id="Picture 15" o:spid="_x0000_s1045" type="#_x0000_t75" alt="Certificate - Free sports and competition icons" style="position:absolute;left:2464;top:2067;width:2921;height:2921;visibility:visible;mso-wrap-style:square" o:gfxdata="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">
+                <v:shape id="Picture 15" o:spid="_x0000_s1045" type="#_x0000_t75" alt="Certificate - Free sports and competition icons" style="position:absolute;top:1600;width:2921;height:2921;visibility:visible;mso-wrap-style:square" o:gfxdata="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">
                   <v:imagedata r:id="rId20" o:title="Certificate - Free sports and competition icons"/>
                 </v:shape>
                 <w10:wrap anchorx="margin"/>
@@ -6220,9 +6283,6 @@
     </w:p>
     <w:p/>
     <w:p/>
-    <w:p/>
-    <w:p/>
-    <w:p/>
     <w:p>
       <w:r>
         <w:rPr>
@@ -6232,16 +6292,16 @@
         <mc:AlternateContent>
           <mc:Choice Requires="wpg">
             <w:drawing>
-              <wp:anchor distT="0" distB="0" distL="114300" distR="114300" simplePos="0" relativeHeight="251721728" behindDoc="1" locked="0" layoutInCell="1" allowOverlap="1" wp14:anchorId="31523CDB" wp14:editId="2FE0C114">
+              <wp:anchor distT="0" distB="0" distL="114300" distR="114300" simplePos="0" relativeHeight="251721728" behindDoc="1" locked="0" layoutInCell="1" allowOverlap="1" wp14:anchorId="31523CDB" wp14:editId="13345424">
                 <wp:simplePos x="0" y="0"/>
-                <wp:positionH relativeFrom="column">
-                  <wp:posOffset>3976</wp:posOffset>
+                <wp:positionH relativeFrom="margin">
+                  <wp:align>right</wp:align>
                 </wp:positionH>
                 <wp:positionV relativeFrom="paragraph">
-                  <wp:posOffset>11209</wp:posOffset>
+                  <wp:posOffset>222885</wp:posOffset>
                 </wp:positionV>
-                <wp:extent cx="3195651" cy="3514477"/>
-                <wp:effectExtent l="0" t="0" r="5080" b="0"/>
+                <wp:extent cx="3200400" cy="3514477"/>
+                <wp:effectExtent l="0" t="0" r="0" b="0"/>
                 <wp:wrapNone/>
                 <wp:docPr id="1613553820" name="Group 22"/>
                 <wp:cNvGraphicFramePr/>
@@ -6252,7 +6312,7 @@
                       <wpg:grpSpPr>
                         <a:xfrm>
                           <a:off x="0" y="0"/>
-                          <a:ext cx="3195651" cy="3514477"/>
+                          <a:ext cx="3200400" cy="3514477"/>
                           <a:chOff x="0" y="0"/>
                           <a:chExt cx="3195651" cy="3514477"/>
                         </a:xfrm>
@@ -6738,12 +6798,18 @@
                     </wpg:wgp>
                   </a:graphicData>
                 </a:graphic>
+                <wp14:sizeRelH relativeFrom="margin">
+                  <wp14:pctWidth>0</wp14:pctWidth>
+                </wp14:sizeRelH>
+                <wp14:sizeRelV relativeFrom="margin">
+                  <wp14:pctHeight>0</wp14:pctHeight>
+                </wp14:sizeRelV>
               </wp:anchor>
             </w:drawing>
           </mc:Choice>
           <mc:Fallback>
             <w:pict>
-              <v:group w14:anchorId="31523CDB" id="Group 22" o:spid="_x0000_s1046" style="position:absolute;margin-left:.3pt;margin-top:.9pt;width:251.65pt;height:276.75pt;z-index:-251594752" coordsize="31956,35144" o:gfxdata="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">
+              <v:group w14:anchorId="31523CDB" id="Group 22" o:spid="_x0000_s1046" style="position:absolute;margin-left:200.8pt;margin-top:17.55pt;width:252pt;height:276.75pt;z-index:-251594752;mso-position-horizontal:right;mso-position-horizontal-relative:margin;mso-width-relative:margin;mso-height-relative:margin" coordsize="31956,35144" o:gfxdata="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">
                 <v:shape id="_x0000_s1047" type="#_x0000_t202" style="position:absolute;width:31956;height:35144;visibility:visible;mso-wrap-style:square;v-text-anchor:top" o:gfxdata="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" fillcolor="white [3201]" stroked="f" strokeweight="1.5pt">
                   <v:textbox>
                     <w:txbxContent>
@@ -7156,19 +7222,13 @@
                 <v:shape id="Picture 21" o:spid="_x0000_s1048" type="#_x0000_t75" alt="Award Icon PNGs for Free Download" style="position:absolute;left:556;top:874;width:3416;height:4090;visibility:visible;mso-wrap-style:square" o:gfxdata="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">
                   <v:imagedata r:id="rId22" o:title="Award Icon PNGs for Free Download"/>
                 </v:shape>
+                <w10:wrap anchorx="margin"/>
               </v:group>
             </w:pict>
           </mc:Fallback>
         </mc:AlternateContent>
       </w:r>
-      <w:r>
-        <w:t xml:space="preserve"> </w:t>
-      </w:r>
     </w:p>
-    <w:p/>
-    <w:p/>
-    <w:p/>
-    <w:p/>
     <w:p/>
     <w:p/>
     <w:p/>
@@ -7192,7 +7252,7 @@
         <mc:AlternateContent>
           <mc:Choice Requires="wps">
             <w:drawing>
-              <wp:anchor distT="45720" distB="45720" distL="114300" distR="114300" simplePos="0" relativeHeight="251702272" behindDoc="1" locked="0" layoutInCell="1" allowOverlap="1" wp14:anchorId="527A67BB" wp14:editId="33D8FA92">
+              <wp:anchor distT="45720" distB="45720" distL="114300" distR="114300" simplePos="0" relativeHeight="251699200" behindDoc="1" locked="0" layoutInCell="1" allowOverlap="1" wp14:anchorId="527A67BB" wp14:editId="3E0F35D7">
                 <wp:simplePos x="0" y="0"/>
                 <wp:positionH relativeFrom="margin">
                   <wp:posOffset>5513070</wp:posOffset>
@@ -7286,7 +7346,7 @@
           </mc:Choice>
           <mc:Fallback>
             <w:pict>
-              <v:shape w14:anchorId="527A67BB" id="_x0000_s1049" type="#_x0000_t202" style="position:absolute;margin-left:434.1pt;margin-top:.45pt;width:90.75pt;height:39pt;z-index:-251614208;visibility:visible;mso-wrap-style:square;mso-width-percent:0;mso-height-percent:0;mso-wrap-distance-left:9pt;mso-wrap-distance-top:3.6pt;mso-wrap-distance-right:9pt;mso-wrap-distance-bottom:3.6pt;mso-position-horizontal:absolute;mso-position-horizontal-relative:margin;mso-position-vertical:absolute;mso-position-vertical-relative:text;mso-width-percent:0;mso-height-percent:0;mso-width-relative:margin;mso-height-relative:margin;v-text-anchor:top" o:gfxdata="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" stroked="f">
+              <v:shape w14:anchorId="527A67BB" id="_x0000_s1049" type="#_x0000_t202" style="position:absolute;margin-left:434.1pt;margin-top:.45pt;width:90.75pt;height:39pt;z-index:-251617280;visibility:visible;mso-wrap-style:square;mso-width-percent:0;mso-height-percent:0;mso-wrap-distance-left:9pt;mso-wrap-distance-top:3.6pt;mso-wrap-distance-right:9pt;mso-wrap-distance-bottom:3.6pt;mso-position-horizontal:absolute;mso-position-horizontal-relative:margin;mso-position-vertical:absolute;mso-position-vertical-relative:text;mso-width-percent:0;mso-height-percent:0;mso-width-relative:margin;mso-height-relative:margin;v-text-anchor:top" o:gfxdata="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" stroked="f">
                 <v:textbox>
                   <w:txbxContent>
                     <w:p>
@@ -7347,6 +7407,120 @@
 <file path=word/numbering.xml><?xml version="1.0" encoding="utf-8"?>
 <w:numbering xmlns:wpc="http://schemas.microsoft.com/office/word/2010/wordprocessingCanvas" xmlns:cx="http://schemas.microsoft.com/office/drawing/2014/chartex" xmlns:cx1="http://schemas.microsoft.com/office/drawing/2015/9/8/chartex" xmlns:cx2="http://schemas.microsoft.com/office/drawing/2015/10/21/chartex" xmlns:cx3="http://schemas.microsoft.com/office/drawing/2016/5/9/chartex" xmlns:cx4="http://schemas.microsoft.com/office/drawing/2016/5/10/chartex" xmlns:cx5="http://schemas.microsoft.com/office/drawing/2016/5/11/chartex" xmlns:cx6="http://schemas.microsoft.com/office/drawing/2016/5/12/chartex" xmlns:cx7="http://schemas.microsoft.com/office/drawing/2016/5/13/chartex" xmlns:cx8="http://schemas.microsoft.com/office/drawing/2016/5/14/chartex" xmlns:mc="http://schemas.openxmlformats.org/markup-compatibility/2006" xmlns:aink="http://schemas.microsoft.com/office/drawing/2016/ink" xmlns:am3d="http://schemas.microsoft.com/office/drawing/2017/model3d" xmlns:o="urn:schemas-microsoft-com:office:office" xmlns:oel="http://schemas.microsoft.com/office/2019/extlst" xmlns:r="http://schemas.openxmlformats.org/officeDocument/2006/relationships" xmlns:m="http://schemas.openxmlformats.org/officeDocument/2006/math" xmlns:v="urn:schemas-microsoft-com:vml" xmlns:wp14="http://schemas.microsoft.com/office/word/2010/wordprocessingDrawing" xmlns:wp="http://schemas.openxmlformats.org/drawingml/2006/wordprocessingDrawing" xmlns:w10="urn:schemas-microsoft-com:office:word" xmlns:w="http://schemas.openxmlformats.org/wordprocessingml/2006/main" xmlns:w14="http://schemas.microsoft.com/office/word/2010/wordml" xmlns:w15="http://schemas.microsoft.com/office/word/2012/wordml" xmlns:w16cex="http://schemas.microsoft.com/office/word/2018/wordml/cex" xmlns:w16cid="http://schemas.microsoft.com/office/word/2016/wordml/cid" xmlns:w16="http://schemas.microsoft.com/office/word/2018/wordml" xmlns:w16du="http://schemas.microsoft.com/office/word/2023/wordml/word16du" xmlns:w16sdtdh="http://schemas.microsoft.com/office/word/2020/wordml/sdtdatahash" xmlns:w16sdtfl="http://schemas.microsoft.com/office/word/2024/wordml/sdtformatlock" xmlns:w16se="http://schemas.microsoft.com/office/word/2015/wordml/symex" xmlns:wpg="http://schemas.microsoft.com/office/word/2010/wordprocessingGroup" xmlns:wpi="http://schemas.microsoft.com/office/word/2010/wordprocessingInk" xmlns:wne="http://schemas.microsoft.com/office/word/2006/wordml" xmlns:wps="http://schemas.microsoft.com/office/word/2010/wordprocessingShape" mc:Ignorable="w14 w15 w16se w16cid w16 w16cex w16sdtdh w16sdtfl w16du wp14">
   <w:abstractNum w:abstractNumId="0" w15:restartNumberingAfterBreak="0">
+    <w:nsid w:val="01025564"/>
+    <w:multiLevelType w:val="hybridMultilevel"/>
+    <w:tmpl w:val="35186962"/>
+    <w:lvl w:ilvl="0" w:tplc="300E044A">
+      <w:start w:val="1"/>
+      <w:numFmt w:val="bullet"/>
+      <w:lvlText w:val="o"/>
+      <w:lvlJc w:val="left"/>
+      <w:pPr>
+        <w:ind w:left="720" w:hanging="360"/>
+      </w:pPr>
+      <w:rPr>
+        <w:rFonts w:ascii="Courier New" w:hAnsi="Courier New" w:cs="Courier New" w:hint="default"/>
+        <w:color w:val="auto"/>
+      </w:rPr>
+    </w:lvl>
+    <w:lvl w:ilvl="1" w:tplc="04090003" w:tentative="1">
+      <w:start w:val="1"/>
+      <w:numFmt w:val="bullet"/>
+      <w:lvlText w:val="o"/>
+      <w:lvlJc w:val="left"/>
+      <w:pPr>
+        <w:ind w:left="1440" w:hanging="360"/>
+      </w:pPr>
+      <w:rPr>
+        <w:rFonts w:ascii="Courier New" w:hAnsi="Courier New" w:cs="Courier New" w:hint="default"/>
+      </w:rPr>
+    </w:lvl>
+    <w:lvl w:ilvl="2" w:tplc="04090005" w:tentative="1">
+      <w:start w:val="1"/>
+      <w:numFmt w:val="bullet"/>
+      <w:lvlText w:val=""/>
+      <w:lvlJc w:val="left"/>
+      <w:pPr>
+        <w:ind w:left="2160" w:hanging="360"/>
+      </w:pPr>
+      <w:rPr>
+        <w:rFonts w:ascii="Wingdings" w:hAnsi="Wingdings" w:hint="default"/>
+      </w:rPr>
+    </w:lvl>
+    <w:lvl w:ilvl="3" w:tplc="04090001" w:tentative="1">
+      <w:start w:val="1"/>
+      <w:numFmt w:val="bullet"/>
+      <w:lvlText w:val=""/>
+      <w:lvlJc w:val="left"/>
+      <w:pPr>
+        <w:ind w:left="2880" w:hanging="360"/>
+      </w:pPr>
+      <w:rPr>
+        <w:rFonts w:ascii="Symbol" w:hAnsi="Symbol" w:hint="default"/>
+      </w:rPr>
+    </w:lvl>
+    <w:lvl w:ilvl="4" w:tplc="04090003" w:tentative="1">
+      <w:start w:val="1"/>
+      <w:numFmt w:val="bullet"/>
+      <w:lvlText w:val="o"/>
+      <w:lvlJc w:val="left"/>
+      <w:pPr>
+        <w:ind w:left="3600" w:hanging="360"/>
+      </w:pPr>
+      <w:rPr>
+        <w:rFonts w:ascii="Courier New" w:hAnsi="Courier New" w:cs="Courier New" w:hint="default"/>
+      </w:rPr>
+    </w:lvl>
+    <w:lvl w:ilvl="5" w:tplc="04090005" w:tentative="1">
+      <w:start w:val="1"/>
+      <w:numFmt w:val="bullet"/>
+      <w:lvlText w:val=""/>
+      <w:lvlJc w:val="left"/>
+      <w:pPr>
+        <w:ind w:left="4320" w:hanging="360"/>
+      </w:pPr>
+      <w:rPr>
+        <w:rFonts w:ascii="Wingdings" w:hAnsi="Wingdings" w:hint="default"/>
+      </w:rPr>
+    </w:lvl>
+    <w:lvl w:ilvl="6" w:tplc="04090001" w:tentative="1">
+      <w:start w:val="1"/>
+      <w:numFmt w:val="bullet"/>
+      <w:lvlText w:val=""/>
+      <w:lvlJc w:val="left"/>
+      <w:pPr>
+        <w:ind w:left="5040" w:hanging="360"/>
+      </w:pPr>
+      <w:rPr>
+        <w:rFonts w:ascii="Symbol" w:hAnsi="Symbol" w:hint="default"/>
+      </w:rPr>
+    </w:lvl>
+    <w:lvl w:ilvl="7" w:tplc="04090003" w:tentative="1">
+      <w:start w:val="1"/>
+      <w:numFmt w:val="bullet"/>
+      <w:lvlText w:val="o"/>
+      <w:lvlJc w:val="left"/>
+      <w:pPr>
+        <w:ind w:left="5760" w:hanging="360"/>
+      </w:pPr>
+      <w:rPr>
+        <w:rFonts w:ascii="Courier New" w:hAnsi="Courier New" w:cs="Courier New" w:hint="default"/>
+      </w:rPr>
+    </w:lvl>
+    <w:lvl w:ilvl="8" w:tplc="04090005" w:tentative="1">
+      <w:start w:val="1"/>
+      <w:numFmt w:val="bullet"/>
+      <w:lvlText w:val=""/>
+      <w:lvlJc w:val="left"/>
+      <w:pPr>
+        <w:ind w:left="6480" w:hanging="360"/>
+      </w:pPr>
+      <w:rPr>
+        <w:rFonts w:ascii="Wingdings" w:hAnsi="Wingdings" w:hint="default"/>
+      </w:rPr>
+    </w:lvl>
+  </w:abstractNum>
+  <w:abstractNum w:abstractNumId="1" w15:restartNumberingAfterBreak="0">
     <w:nsid w:val="16BD7988"/>
     <w:multiLevelType w:val="hybridMultilevel"/>
     <w:tmpl w:val="D5FA63D0"/>
@@ -7356,7 +7530,7 @@
       <w:lvlText w:val="o"/>
       <w:lvlJc w:val="left"/>
       <w:pPr>
-        <w:ind w:left="1080" w:hanging="360"/>
+        <w:ind w:left="360" w:hanging="360"/>
       </w:pPr>
       <w:rPr>
         <w:rFonts w:ascii="Courier New" w:hAnsi="Courier New" w:cs="Courier New" w:hint="default"/>
@@ -7369,19 +7543,133 @@
       <w:lvlText w:val="o"/>
       <w:lvlJc w:val="left"/>
       <w:pPr>
+        <w:ind w:left="1080" w:hanging="360"/>
+      </w:pPr>
+      <w:rPr>
+        <w:rFonts w:ascii="Courier New" w:hAnsi="Courier New" w:cs="Courier New" w:hint="default"/>
+      </w:rPr>
+    </w:lvl>
+    <w:lvl w:ilvl="2" w:tplc="04090005" w:tentative="1">
+      <w:start w:val="1"/>
+      <w:numFmt w:val="bullet"/>
+      <w:lvlText w:val=""/>
+      <w:lvlJc w:val="left"/>
+      <w:pPr>
         <w:ind w:left="1800" w:hanging="360"/>
       </w:pPr>
       <w:rPr>
+        <w:rFonts w:ascii="Wingdings" w:hAnsi="Wingdings" w:hint="default"/>
+      </w:rPr>
+    </w:lvl>
+    <w:lvl w:ilvl="3" w:tplc="04090001" w:tentative="1">
+      <w:start w:val="1"/>
+      <w:numFmt w:val="bullet"/>
+      <w:lvlText w:val=""/>
+      <w:lvlJc w:val="left"/>
+      <w:pPr>
+        <w:ind w:left="2520" w:hanging="360"/>
+      </w:pPr>
+      <w:rPr>
+        <w:rFonts w:ascii="Symbol" w:hAnsi="Symbol" w:hint="default"/>
+      </w:rPr>
+    </w:lvl>
+    <w:lvl w:ilvl="4" w:tplc="04090003" w:tentative="1">
+      <w:start w:val="1"/>
+      <w:numFmt w:val="bullet"/>
+      <w:lvlText w:val="o"/>
+      <w:lvlJc w:val="left"/>
+      <w:pPr>
+        <w:ind w:left="3240" w:hanging="360"/>
+      </w:pPr>
+      <w:rPr>
         <w:rFonts w:ascii="Courier New" w:hAnsi="Courier New" w:cs="Courier New" w:hint="default"/>
       </w:rPr>
     </w:lvl>
+    <w:lvl w:ilvl="5" w:tplc="04090005" w:tentative="1">
+      <w:start w:val="1"/>
+      <w:numFmt w:val="bullet"/>
+      <w:lvlText w:val=""/>
+      <w:lvlJc w:val="left"/>
+      <w:pPr>
+        <w:ind w:left="3960" w:hanging="360"/>
+      </w:pPr>
+      <w:rPr>
+        <w:rFonts w:ascii="Wingdings" w:hAnsi="Wingdings" w:hint="default"/>
+      </w:rPr>
+    </w:lvl>
+    <w:lvl w:ilvl="6" w:tplc="04090001" w:tentative="1">
+      <w:start w:val="1"/>
+      <w:numFmt w:val="bullet"/>
+      <w:lvlText w:val=""/>
+      <w:lvlJc w:val="left"/>
+      <w:pPr>
+        <w:ind w:left="4680" w:hanging="360"/>
+      </w:pPr>
+      <w:rPr>
+        <w:rFonts w:ascii="Symbol" w:hAnsi="Symbol" w:hint="default"/>
+      </w:rPr>
+    </w:lvl>
+    <w:lvl w:ilvl="7" w:tplc="04090003" w:tentative="1">
+      <w:start w:val="1"/>
+      <w:numFmt w:val="bullet"/>
+      <w:lvlText w:val="o"/>
+      <w:lvlJc w:val="left"/>
+      <w:pPr>
+        <w:ind w:left="5400" w:hanging="360"/>
+      </w:pPr>
+      <w:rPr>
+        <w:rFonts w:ascii="Courier New" w:hAnsi="Courier New" w:cs="Courier New" w:hint="default"/>
+      </w:rPr>
+    </w:lvl>
+    <w:lvl w:ilvl="8" w:tplc="04090005" w:tentative="1">
+      <w:start w:val="1"/>
+      <w:numFmt w:val="bullet"/>
+      <w:lvlText w:val=""/>
+      <w:lvlJc w:val="left"/>
+      <w:pPr>
+        <w:ind w:left="6120" w:hanging="360"/>
+      </w:pPr>
+      <w:rPr>
+        <w:rFonts w:ascii="Wingdings" w:hAnsi="Wingdings" w:hint="default"/>
+      </w:rPr>
+    </w:lvl>
+  </w:abstractNum>
+  <w:abstractNum w:abstractNumId="2" w15:restartNumberingAfterBreak="0">
+    <w:nsid w:val="1BB81762"/>
+    <w:multiLevelType w:val="hybridMultilevel"/>
+    <w:tmpl w:val="2CC02378"/>
+    <w:lvl w:ilvl="0" w:tplc="300E044A">
+      <w:start w:val="1"/>
+      <w:numFmt w:val="bullet"/>
+      <w:lvlText w:val="o"/>
+      <w:lvlJc w:val="left"/>
+      <w:pPr>
+        <w:ind w:left="720" w:hanging="360"/>
+      </w:pPr>
+      <w:rPr>
+        <w:rFonts w:ascii="Courier New" w:hAnsi="Courier New" w:cs="Courier New" w:hint="default"/>
+        <w:color w:val="auto"/>
+      </w:rPr>
+    </w:lvl>
+    <w:lvl w:ilvl="1" w:tplc="04090003" w:tentative="1">
+      <w:start w:val="1"/>
+      <w:numFmt w:val="bullet"/>
+      <w:lvlText w:val="o"/>
+      <w:lvlJc w:val="left"/>
+      <w:pPr>
+        <w:ind w:left="1440" w:hanging="360"/>
+      </w:pPr>
+      <w:rPr>
+        <w:rFonts w:ascii="Courier New" w:hAnsi="Courier New" w:cs="Courier New" w:hint="default"/>
+      </w:rPr>
+    </w:lvl>
     <w:lvl w:ilvl="2" w:tplc="04090005" w:tentative="1">
       <w:start w:val="1"/>
       <w:numFmt w:val="bullet"/>
       <w:lvlText w:val=""/>
       <w:lvlJc w:val="left"/>
       <w:pPr>
-        <w:ind w:left="2520" w:hanging="360"/>
+        <w:ind w:left="2160" w:hanging="360"/>
       </w:pPr>
       <w:rPr>
         <w:rFonts w:ascii="Wingdings" w:hAnsi="Wingdings" w:hint="default"/>
@@ -7393,7 +7681,7 @@
       <w:lvlText w:val=""/>
       <w:lvlJc w:val="left"/>
       <w:pPr>
-        <w:ind w:left="3240" w:hanging="360"/>
+        <w:ind w:left="2880" w:hanging="360"/>
       </w:pPr>
       <w:rPr>
         <w:rFonts w:ascii="Symbol" w:hAnsi="Symbol" w:hint="default"/>
@@ -7405,7 +7693,7 @@
       <w:lvlText w:val="o"/>
       <w:lvlJc w:val="left"/>
       <w:pPr>
-        <w:ind w:left="3960" w:hanging="360"/>
+        <w:ind w:left="3600" w:hanging="360"/>
       </w:pPr>
       <w:rPr>
         <w:rFonts w:ascii="Courier New" w:hAnsi="Courier New" w:cs="Courier New" w:hint="default"/>
@@ -7417,7 +7705,7 @@
       <w:lvlText w:val=""/>
       <w:lvlJc w:val="left"/>
       <w:pPr>
-        <w:ind w:left="4680" w:hanging="360"/>
+        <w:ind w:left="4320" w:hanging="360"/>
       </w:pPr>
       <w:rPr>
         <w:rFonts w:ascii="Wingdings" w:hAnsi="Wingdings" w:hint="default"/>
@@ -7429,7 +7717,7 @@
       <w:lvlText w:val=""/>
       <w:lvlJc w:val="left"/>
       <w:pPr>
-        <w:ind w:left="5400" w:hanging="360"/>
+        <w:ind w:left="5040" w:hanging="360"/>
       </w:pPr>
       <w:rPr>
         <w:rFonts w:ascii="Symbol" w:hAnsi="Symbol" w:hint="default"/>
@@ -7441,7 +7729,7 @@
       <w:lvlText w:val="o"/>
       <w:lvlJc w:val="left"/>
       <w:pPr>
-        <w:ind w:left="6120" w:hanging="360"/>
+        <w:ind w:left="5760" w:hanging="360"/>
       </w:pPr>
       <w:rPr>
         <w:rFonts w:ascii="Courier New" w:hAnsi="Courier New" w:cs="Courier New" w:hint="default"/>
@@ -7453,14 +7741,128 @@
       <w:lvlText w:val=""/>
       <w:lvlJc w:val="left"/>
       <w:pPr>
-        <w:ind w:left="6840" w:hanging="360"/>
+        <w:ind w:left="6480" w:hanging="360"/>
       </w:pPr>
       <w:rPr>
         <w:rFonts w:ascii="Wingdings" w:hAnsi="Wingdings" w:hint="default"/>
       </w:rPr>
     </w:lvl>
   </w:abstractNum>
-  <w:abstractNum w:abstractNumId="1" w15:restartNumberingAfterBreak="0">
+  <w:abstractNum w:abstractNumId="3" w15:restartNumberingAfterBreak="0">
+    <w:nsid w:val="206B5DF0"/>
+    <w:multiLevelType w:val="hybridMultilevel"/>
+    <w:tmpl w:val="FCAC078C"/>
+    <w:lvl w:ilvl="0" w:tplc="300E044A">
+      <w:start w:val="1"/>
+      <w:numFmt w:val="bullet"/>
+      <w:lvlText w:val="o"/>
+      <w:lvlJc w:val="left"/>
+      <w:pPr>
+        <w:ind w:left="720" w:hanging="360"/>
+      </w:pPr>
+      <w:rPr>
+        <w:rFonts w:ascii="Courier New" w:hAnsi="Courier New" w:cs="Courier New" w:hint="default"/>
+        <w:color w:val="auto"/>
+      </w:rPr>
+    </w:lvl>
+    <w:lvl w:ilvl="1" w:tplc="04090003" w:tentative="1">
+      <w:start w:val="1"/>
+      <w:numFmt w:val="bullet"/>
+      <w:lvlText w:val="o"/>
+      <w:lvlJc w:val="left"/>
+      <w:pPr>
+        <w:ind w:left="1440" w:hanging="360"/>
+      </w:pPr>
+      <w:rPr>
+        <w:rFonts w:ascii="Courier New" w:hAnsi="Courier New" w:cs="Courier New" w:hint="default"/>
+      </w:rPr>
+    </w:lvl>
+    <w:lvl w:ilvl="2" w:tplc="04090005" w:tentative="1">
+      <w:start w:val="1"/>
+      <w:numFmt w:val="bullet"/>
+      <w:lvlText w:val=""/>
+      <w:lvlJc w:val="left"/>
+      <w:pPr>
+        <w:ind w:left="2160" w:hanging="360"/>
+      </w:pPr>
+      <w:rPr>
+        <w:rFonts w:ascii="Wingdings" w:hAnsi="Wingdings" w:hint="default"/>
+      </w:rPr>
+    </w:lvl>
+    <w:lvl w:ilvl="3" w:tplc="04090001" w:tentative="1">
+      <w:start w:val="1"/>
+      <w:numFmt w:val="bullet"/>
+      <w:lvlText w:val=""/>
+      <w:lvlJc w:val="left"/>
+      <w:pPr>
+        <w:ind w:left="2880" w:hanging="360"/>
+      </w:pPr>
+      <w:rPr>
+        <w:rFonts w:ascii="Symbol" w:hAnsi="Symbol" w:hint="default"/>
+      </w:rPr>
+    </w:lvl>
+    <w:lvl w:ilvl="4" w:tplc="04090003" w:tentative="1">
+      <w:start w:val="1"/>
+      <w:numFmt w:val="bullet"/>
+      <w:lvlText w:val="o"/>
+      <w:lvlJc w:val="left"/>
+      <w:pPr>
+        <w:ind w:left="3600" w:hanging="360"/>
+      </w:pPr>
+      <w:rPr>
+        <w:rFonts w:ascii="Courier New" w:hAnsi="Courier New" w:cs="Courier New" w:hint="default"/>
+      </w:rPr>
+    </w:lvl>
+    <w:lvl w:ilvl="5" w:tplc="04090005" w:tentative="1">
+      <w:start w:val="1"/>
+      <w:numFmt w:val="bullet"/>
+      <w:lvlText w:val=""/>
+      <w:lvlJc w:val="left"/>
+      <w:pPr>
+        <w:ind w:left="4320" w:hanging="360"/>
+      </w:pPr>
+      <w:rPr>
+        <w:rFonts w:ascii="Wingdings" w:hAnsi="Wingdings" w:hint="default"/>
+      </w:rPr>
+    </w:lvl>
+    <w:lvl w:ilvl="6" w:tplc="04090001" w:tentative="1">
+      <w:start w:val="1"/>
+      <w:numFmt w:val="bullet"/>
+      <w:lvlText w:val=""/>
+      <w:lvlJc w:val="left"/>
+      <w:pPr>
+        <w:ind w:left="5040" w:hanging="360"/>
+      </w:pPr>
+      <w:rPr>
+        <w:rFonts w:ascii="Symbol" w:hAnsi="Symbol" w:hint="default"/>
+      </w:rPr>
+    </w:lvl>
+    <w:lvl w:ilvl="7" w:tplc="04090003" w:tentative="1">
+      <w:start w:val="1"/>
+      <w:numFmt w:val="bullet"/>
+      <w:lvlText w:val="o"/>
+      <w:lvlJc w:val="left"/>
+      <w:pPr>
+        <w:ind w:left="5760" w:hanging="360"/>
+      </w:pPr>
+      <w:rPr>
+        <w:rFonts w:ascii="Courier New" w:hAnsi="Courier New" w:cs="Courier New" w:hint="default"/>
+      </w:rPr>
+    </w:lvl>
+    <w:lvl w:ilvl="8" w:tplc="04090005" w:tentative="1">
+      <w:start w:val="1"/>
+      <w:numFmt w:val="bullet"/>
+      <w:lvlText w:val=""/>
+      <w:lvlJc w:val="left"/>
+      <w:pPr>
+        <w:ind w:left="6480" w:hanging="360"/>
+      </w:pPr>
+      <w:rPr>
+        <w:rFonts w:ascii="Wingdings" w:hAnsi="Wingdings" w:hint="default"/>
+      </w:rPr>
+    </w:lvl>
+  </w:abstractNum>
+  <w:abstractNum w:abstractNumId="4" w15:restartNumberingAfterBreak="0">
     <w:nsid w:val="21A15E71"/>
     <w:multiLevelType w:val="hybridMultilevel"/>
     <w:tmpl w:val="BD6C7C48"/>
@@ -7573,7 +7975,7 @@
       </w:rPr>
     </w:lvl>
   </w:abstractNum>
-  <w:abstractNum w:abstractNumId="2" w15:restartNumberingAfterBreak="0">
+  <w:abstractNum w:abstractNumId="5" w15:restartNumberingAfterBreak="0">
     <w:nsid w:val="222F254E"/>
     <w:multiLevelType w:val="hybridMultilevel"/>
     <w:tmpl w:val="D5582780"/>
@@ -7686,7 +8088,7 @@
       </w:rPr>
     </w:lvl>
   </w:abstractNum>
-  <w:abstractNum w:abstractNumId="3" w15:restartNumberingAfterBreak="0">
+  <w:abstractNum w:abstractNumId="6" w15:restartNumberingAfterBreak="0">
     <w:nsid w:val="36033CA5"/>
     <w:multiLevelType w:val="hybridMultilevel"/>
     <w:tmpl w:val="98544EAA"/>
@@ -7775,7 +8177,7 @@
       </w:pPr>
     </w:lvl>
   </w:abstractNum>
-  <w:abstractNum w:abstractNumId="4" w15:restartNumberingAfterBreak="0">
+  <w:abstractNum w:abstractNumId="7" w15:restartNumberingAfterBreak="0">
     <w:nsid w:val="519176E8"/>
     <w:multiLevelType w:val="hybridMultilevel"/>
     <w:tmpl w:val="6A12ACF0"/>
@@ -7888,7 +8290,121 @@
       </w:rPr>
     </w:lvl>
   </w:abstractNum>
-  <w:abstractNum w:abstractNumId="5" w15:restartNumberingAfterBreak="0">
+  <w:abstractNum w:abstractNumId="8" w15:restartNumberingAfterBreak="0">
+    <w:nsid w:val="55351B8A"/>
+    <w:multiLevelType w:val="hybridMultilevel"/>
+    <w:tmpl w:val="6944CB44"/>
+    <w:lvl w:ilvl="0" w:tplc="300E044A">
+      <w:start w:val="1"/>
+      <w:numFmt w:val="bullet"/>
+      <w:lvlText w:val="o"/>
+      <w:lvlJc w:val="left"/>
+      <w:pPr>
+        <w:ind w:left="720" w:hanging="360"/>
+      </w:pPr>
+      <w:rPr>
+        <w:rFonts w:ascii="Courier New" w:hAnsi="Courier New" w:cs="Courier New" w:hint="default"/>
+        <w:color w:val="auto"/>
+      </w:rPr>
+    </w:lvl>
+    <w:lvl w:ilvl="1" w:tplc="04090003" w:tentative="1">
+      <w:start w:val="1"/>
+      <w:numFmt w:val="bullet"/>
+      <w:lvlText w:val="o"/>
+      <w:lvlJc w:val="left"/>
+      <w:pPr>
+        <w:ind w:left="1440" w:hanging="360"/>
+      </w:pPr>
+      <w:rPr>
+        <w:rFonts w:ascii="Courier New" w:hAnsi="Courier New" w:cs="Courier New" w:hint="default"/>
+      </w:rPr>
+    </w:lvl>
+    <w:lvl w:ilvl="2" w:tplc="04090005" w:tentative="1">
+      <w:start w:val="1"/>
+      <w:numFmt w:val="bullet"/>
+      <w:lvlText w:val=""/>
+      <w:lvlJc w:val="left"/>
+      <w:pPr>
+        <w:ind w:left="2160" w:hanging="360"/>
+      </w:pPr>
+      <w:rPr>
+        <w:rFonts w:ascii="Wingdings" w:hAnsi="Wingdings" w:hint="default"/>
+      </w:rPr>
+    </w:lvl>
+    <w:lvl w:ilvl="3" w:tplc="04090001" w:tentative="1">
+      <w:start w:val="1"/>
+      <w:numFmt w:val="bullet"/>
+      <w:lvlText w:val=""/>
+      <w:lvlJc w:val="left"/>
+      <w:pPr>
+        <w:ind w:left="2880" w:hanging="360"/>
+      </w:pPr>
+      <w:rPr>
+        <w:rFonts w:ascii="Symbol" w:hAnsi="Symbol" w:hint="default"/>
+      </w:rPr>
+    </w:lvl>
+    <w:lvl w:ilvl="4" w:tplc="04090003" w:tentative="1">
+      <w:start w:val="1"/>
+      <w:numFmt w:val="bullet"/>
+      <w:lvlText w:val="o"/>
+      <w:lvlJc w:val="left"/>
+      <w:pPr>
+        <w:ind w:left="3600" w:hanging="360"/>
+      </w:pPr>
+      <w:rPr>
+        <w:rFonts w:ascii="Courier New" w:hAnsi="Courier New" w:cs="Courier New" w:hint="default"/>
+      </w:rPr>
+    </w:lvl>
+    <w:lvl w:ilvl="5" w:tplc="04090005" w:tentative="1">
+      <w:start w:val="1"/>
+      <w:numFmt w:val="bullet"/>
+      <w:lvlText w:val=""/>
+      <w:lvlJc w:val="left"/>
+      <w:pPr>
+        <w:ind w:left="4320" w:hanging="360"/>
+      </w:pPr>
+      <w:rPr>
+        <w:rFonts w:ascii="Wingdings" w:hAnsi="Wingdings" w:hint="default"/>
+      </w:rPr>
+    </w:lvl>
+    <w:lvl w:ilvl="6" w:tplc="04090001" w:tentative="1">
+      <w:start w:val="1"/>
+      <w:numFmt w:val="bullet"/>
+      <w:lvlText w:val=""/>
+      <w:lvlJc w:val="left"/>
+      <w:pPr>
+        <w:ind w:left="5040" w:hanging="360"/>
+      </w:pPr>
+      <w:rPr>
+        <w:rFonts w:ascii="Symbol" w:hAnsi="Symbol" w:hint="default"/>
+      </w:rPr>
+    </w:lvl>
+    <w:lvl w:ilvl="7" w:tplc="04090003" w:tentative="1">
+      <w:start w:val="1"/>
+      <w:numFmt w:val="bullet"/>
+      <w:lvlText w:val="o"/>
+      <w:lvlJc w:val="left"/>
+      <w:pPr>
+        <w:ind w:left="5760" w:hanging="360"/>
+      </w:pPr>
+      <w:rPr>
+        <w:rFonts w:ascii="Courier New" w:hAnsi="Courier New" w:cs="Courier New" w:hint="default"/>
+      </w:rPr>
+    </w:lvl>
+    <w:lvl w:ilvl="8" w:tplc="04090005" w:tentative="1">
+      <w:start w:val="1"/>
+      <w:numFmt w:val="bullet"/>
+      <w:lvlText w:val=""/>
+      <w:lvlJc w:val="left"/>
+      <w:pPr>
+        <w:ind w:left="6480" w:hanging="360"/>
+      </w:pPr>
+      <w:rPr>
+        <w:rFonts w:ascii="Wingdings" w:hAnsi="Wingdings" w:hint="default"/>
+      </w:rPr>
+    </w:lvl>
+  </w:abstractNum>
+  <w:abstractNum w:abstractNumId="9" w15:restartNumberingAfterBreak="0">
     <w:nsid w:val="57202F98"/>
     <w:multiLevelType w:val="hybridMultilevel"/>
     <w:tmpl w:val="22F68BAA"/>
@@ -7898,7 +8414,7 @@
       <w:lvlText w:val="o"/>
       <w:lvlJc w:val="left"/>
       <w:pPr>
-        <w:ind w:left="360" w:hanging="360"/>
+        <w:ind w:left="720" w:hanging="360"/>
       </w:pPr>
       <w:rPr>
         <w:rFonts w:ascii="Courier New" w:hAnsi="Courier New" w:cs="Courier New" w:hint="default"/>
@@ -7910,7 +8426,7 @@
       <w:lvlText w:val="o"/>
       <w:lvlJc w:val="left"/>
       <w:pPr>
-        <w:ind w:left="1080" w:hanging="360"/>
+        <w:ind w:left="1440" w:hanging="360"/>
       </w:pPr>
       <w:rPr>
         <w:rFonts w:ascii="Courier New" w:hAnsi="Courier New" w:cs="Courier New" w:hint="default"/>
@@ -7922,7 +8438,7 @@
       <w:lvlText w:val=""/>
       <w:lvlJc w:val="left"/>
       <w:pPr>
-        <w:ind w:left="1800" w:hanging="360"/>
+        <w:ind w:left="2160" w:hanging="360"/>
       </w:pPr>
       <w:rPr>
         <w:rFonts w:ascii="Wingdings" w:hAnsi="Wingdings" w:hint="default"/>
@@ -7934,7 +8450,7 @@
       <w:lvlText w:val=""/>
       <w:lvlJc w:val="left"/>
       <w:pPr>
-        <w:ind w:left="2520" w:hanging="360"/>
+        <w:ind w:left="2880" w:hanging="360"/>
       </w:pPr>
       <w:rPr>
         <w:rFonts w:ascii="Symbol" w:hAnsi="Symbol" w:hint="default"/>
@@ -7946,7 +8462,7 @@
       <w:lvlText w:val="o"/>
       <w:lvlJc w:val="left"/>
       <w:pPr>
-        <w:ind w:left="3240" w:hanging="360"/>
+        <w:ind w:left="3600" w:hanging="360"/>
       </w:pPr>
       <w:rPr>
         <w:rFonts w:ascii="Courier New" w:hAnsi="Courier New" w:cs="Courier New" w:hint="default"/>
@@ -7958,7 +8474,7 @@
       <w:lvlText w:val=""/>
       <w:lvlJc w:val="left"/>
       <w:pPr>
-        <w:ind w:left="3960" w:hanging="360"/>
+        <w:ind w:left="4320" w:hanging="360"/>
       </w:pPr>
       <w:rPr>
         <w:rFonts w:ascii="Wingdings" w:hAnsi="Wingdings" w:hint="default"/>
@@ -7970,7 +8486,7 @@
       <w:lvlText w:val=""/>
       <w:lvlJc w:val="left"/>
       <w:pPr>
-        <w:ind w:left="4680" w:hanging="360"/>
+        <w:ind w:left="5040" w:hanging="360"/>
       </w:pPr>
       <w:rPr>
         <w:rFonts w:ascii="Symbol" w:hAnsi="Symbol" w:hint="default"/>
@@ -7982,7 +8498,7 @@
       <w:lvlText w:val="o"/>
       <w:lvlJc w:val="left"/>
       <w:pPr>
-        <w:ind w:left="5400" w:hanging="360"/>
+        <w:ind w:left="5760" w:hanging="360"/>
       </w:pPr>
       <w:rPr>
         <w:rFonts w:ascii="Courier New" w:hAnsi="Courier New" w:cs="Courier New" w:hint="default"/>
@@ -7994,14 +8510,14 @@
       <w:lvlText w:val=""/>
       <w:lvlJc w:val="left"/>
       <w:pPr>
-        <w:ind w:left="6120" w:hanging="360"/>
+        <w:ind w:left="6480" w:hanging="360"/>
       </w:pPr>
       <w:rPr>
         <w:rFonts w:ascii="Wingdings" w:hAnsi="Wingdings" w:hint="default"/>
       </w:rPr>
     </w:lvl>
   </w:abstractNum>
-  <w:abstractNum w:abstractNumId="6" w15:restartNumberingAfterBreak="0">
+  <w:abstractNum w:abstractNumId="10" w15:restartNumberingAfterBreak="0">
     <w:nsid w:val="578C59C8"/>
     <w:multiLevelType w:val="hybridMultilevel"/>
     <w:tmpl w:val="0922A832"/>
@@ -8114,7 +8630,7 @@
       </w:rPr>
     </w:lvl>
   </w:abstractNum>
-  <w:abstractNum w:abstractNumId="7" w15:restartNumberingAfterBreak="0">
+  <w:abstractNum w:abstractNumId="11" w15:restartNumberingAfterBreak="0">
     <w:nsid w:val="579C3A5E"/>
     <w:multiLevelType w:val="hybridMultilevel"/>
     <w:tmpl w:val="2C3C4E0E"/>
@@ -8203,7 +8719,7 @@
       </w:pPr>
     </w:lvl>
   </w:abstractNum>
-  <w:abstractNum w:abstractNumId="8" w15:restartNumberingAfterBreak="0">
+  <w:abstractNum w:abstractNumId="12" w15:restartNumberingAfterBreak="0">
     <w:nsid w:val="59A85302"/>
     <w:multiLevelType w:val="hybridMultilevel"/>
     <w:tmpl w:val="611E3D00"/>
@@ -8316,7 +8832,7 @@
       </w:rPr>
     </w:lvl>
   </w:abstractNum>
-  <w:abstractNum w:abstractNumId="9" w15:restartNumberingAfterBreak="0">
+  <w:abstractNum w:abstractNumId="13" w15:restartNumberingAfterBreak="0">
     <w:nsid w:val="5FDD6183"/>
     <w:multiLevelType w:val="hybridMultilevel"/>
     <w:tmpl w:val="A46688C6"/>
@@ -8326,7 +8842,7 @@
       <w:lvlText w:val="o"/>
       <w:lvlJc w:val="left"/>
       <w:pPr>
-        <w:ind w:left="360" w:hanging="360"/>
+        <w:ind w:left="720" w:hanging="360"/>
       </w:pPr>
       <w:rPr>
         <w:rFonts w:ascii="Courier New" w:hAnsi="Courier New" w:cs="Courier New" w:hint="default"/>
@@ -8338,7 +8854,7 @@
       <w:lvlText w:val="o"/>
       <w:lvlJc w:val="left"/>
       <w:pPr>
-        <w:ind w:left="1080" w:hanging="360"/>
+        <w:ind w:left="1440" w:hanging="360"/>
       </w:pPr>
       <w:rPr>
         <w:rFonts w:ascii="Courier New" w:hAnsi="Courier New" w:cs="Courier New" w:hint="default"/>
@@ -8350,7 +8866,7 @@
       <w:lvlText w:val=""/>
       <w:lvlJc w:val="left"/>
       <w:pPr>
-        <w:ind w:left="1800" w:hanging="360"/>
+        <w:ind w:left="2160" w:hanging="360"/>
       </w:pPr>
       <w:rPr>
         <w:rFonts w:ascii="Wingdings" w:hAnsi="Wingdings" w:hint="default"/>
@@ -8362,7 +8878,7 @@
       <w:lvlText w:val=""/>
       <w:lvlJc w:val="left"/>
       <w:pPr>
-        <w:ind w:left="2520" w:hanging="360"/>
+        <w:ind w:left="2880" w:hanging="360"/>
       </w:pPr>
       <w:rPr>
         <w:rFonts w:ascii="Symbol" w:hAnsi="Symbol" w:hint="default"/>
@@ -8374,7 +8890,7 @@
       <w:lvlText w:val="o"/>
       <w:lvlJc w:val="left"/>
       <w:pPr>
-        <w:ind w:left="3240" w:hanging="360"/>
+        <w:ind w:left="3600" w:hanging="360"/>
       </w:pPr>
       <w:rPr>
         <w:rFonts w:ascii="Courier New" w:hAnsi="Courier New" w:cs="Courier New" w:hint="default"/>
@@ -8386,7 +8902,7 @@
       <w:lvlText w:val=""/>
       <w:lvlJc w:val="left"/>
       <w:pPr>
-        <w:ind w:left="3960" w:hanging="360"/>
+        <w:ind w:left="4320" w:hanging="360"/>
       </w:pPr>
       <w:rPr>
         <w:rFonts w:ascii="Wingdings" w:hAnsi="Wingdings" w:hint="default"/>
@@ -8398,7 +8914,7 @@
       <w:lvlText w:val=""/>
       <w:lvlJc w:val="left"/>
       <w:pPr>
-        <w:ind w:left="4680" w:hanging="360"/>
+        <w:ind w:left="5040" w:hanging="360"/>
       </w:pPr>
       <w:rPr>
         <w:rFonts w:ascii="Symbol" w:hAnsi="Symbol" w:hint="default"/>
@@ -8410,7 +8926,7 @@
       <w:lvlText w:val="o"/>
       <w:lvlJc w:val="left"/>
       <w:pPr>
-        <w:ind w:left="5400" w:hanging="360"/>
+        <w:ind w:left="5760" w:hanging="360"/>
       </w:pPr>
       <w:rPr>
         <w:rFonts w:ascii="Courier New" w:hAnsi="Courier New" w:cs="Courier New" w:hint="default"/>
@@ -8422,14 +8938,14 @@
       <w:lvlText w:val=""/>
       <w:lvlJc w:val="left"/>
       <w:pPr>
-        <w:ind w:left="6120" w:hanging="360"/>
+        <w:ind w:left="6480" w:hanging="360"/>
       </w:pPr>
       <w:rPr>
         <w:rFonts w:ascii="Wingdings" w:hAnsi="Wingdings" w:hint="default"/>
       </w:rPr>
     </w:lvl>
   </w:abstractNum>
-  <w:abstractNum w:abstractNumId="10" w15:restartNumberingAfterBreak="0">
+  <w:abstractNum w:abstractNumId="14" w15:restartNumberingAfterBreak="0">
     <w:nsid w:val="62D25B6E"/>
     <w:multiLevelType w:val="hybridMultilevel"/>
     <w:tmpl w:val="1EFC26B4"/>
@@ -8542,7 +9058,7 @@
       </w:rPr>
     </w:lvl>
   </w:abstractNum>
-  <w:abstractNum w:abstractNumId="11" w15:restartNumberingAfterBreak="0">
+  <w:abstractNum w:abstractNumId="15" w15:restartNumberingAfterBreak="0">
     <w:nsid w:val="63EC2A18"/>
     <w:multiLevelType w:val="hybridMultilevel"/>
     <w:tmpl w:val="3B8263FA"/>
@@ -8655,10 +9171,10 @@
       </w:rPr>
     </w:lvl>
   </w:abstractNum>
-  <w:abstractNum w:abstractNumId="12" w15:restartNumberingAfterBreak="0">
+  <w:abstractNum w:abstractNumId="16" w15:restartNumberingAfterBreak="0">
     <w:nsid w:val="6C635299"/>
     <w:multiLevelType w:val="hybridMultilevel"/>
-    <w:tmpl w:val="B03A2C82"/>
+    <w:tmpl w:val="EA30C7B4"/>
     <w:lvl w:ilvl="0" w:tplc="0409000F">
       <w:start w:val="1"/>
       <w:numFmt w:val="decimal"/>
@@ -8741,7 +9257,7 @@
       </w:pPr>
     </w:lvl>
   </w:abstractNum>
-  <w:abstractNum w:abstractNumId="13" w15:restartNumberingAfterBreak="0">
+  <w:abstractNum w:abstractNumId="17" w15:restartNumberingAfterBreak="0">
     <w:nsid w:val="71D01612"/>
     <w:multiLevelType w:val="hybridMultilevel"/>
     <w:tmpl w:val="CCEE6986"/>
@@ -8854,7 +9370,7 @@
       </w:rPr>
     </w:lvl>
   </w:abstractNum>
-  <w:abstractNum w:abstractNumId="14" w15:restartNumberingAfterBreak="0">
+  <w:abstractNum w:abstractNumId="18" w15:restartNumberingAfterBreak="0">
     <w:nsid w:val="7CF463B2"/>
     <w:multiLevelType w:val="hybridMultilevel"/>
     <w:tmpl w:val="7D2A35E6"/>
@@ -8941,49 +9457,61 @@
     </w:lvl>
   </w:abstractNum>
   <w:num w:numId="1" w16cid:durableId="18241660">
-    <w:abstractNumId w:val="8"/>
+    <w:abstractNumId w:val="12"/>
   </w:num>
   <w:num w:numId="2" w16cid:durableId="577599521">
+    <w:abstractNumId w:val="15"/>
+  </w:num>
+  <w:num w:numId="3" w16cid:durableId="1204749835">
+    <w:abstractNumId w:val="14"/>
+  </w:num>
+  <w:num w:numId="4" w16cid:durableId="1819766190">
+    <w:abstractNumId w:val="10"/>
+  </w:num>
+  <w:num w:numId="5" w16cid:durableId="427164934">
+    <w:abstractNumId w:val="17"/>
+  </w:num>
+  <w:num w:numId="6" w16cid:durableId="1934317433">
+    <w:abstractNumId w:val="7"/>
+  </w:num>
+  <w:num w:numId="7" w16cid:durableId="582572779">
+    <w:abstractNumId w:val="5"/>
+  </w:num>
+  <w:num w:numId="8" w16cid:durableId="1869222788">
+    <w:abstractNumId w:val="13"/>
+  </w:num>
+  <w:num w:numId="9" w16cid:durableId="520969194">
+    <w:abstractNumId w:val="16"/>
+  </w:num>
+  <w:num w:numId="10" w16cid:durableId="150024092">
+    <w:abstractNumId w:val="4"/>
+  </w:num>
+  <w:num w:numId="11" w16cid:durableId="2099323962">
+    <w:abstractNumId w:val="18"/>
+  </w:num>
+  <w:num w:numId="12" w16cid:durableId="1194611696">
     <w:abstractNumId w:val="11"/>
   </w:num>
-  <w:num w:numId="3" w16cid:durableId="1204749835">
-    <w:abstractNumId w:val="10"/>
-  </w:num>
-  <w:num w:numId="4" w16cid:durableId="1819766190">
+  <w:num w:numId="13" w16cid:durableId="1968971472">
     <w:abstractNumId w:val="6"/>
   </w:num>
-  <w:num w:numId="5" w16cid:durableId="427164934">
-    <w:abstractNumId w:val="13"/>
+  <w:num w:numId="14" w16cid:durableId="509490107">
+    <w:abstractNumId w:val="9"/>
   </w:num>
-  <w:num w:numId="6" w16cid:durableId="1934317433">
-    <w:abstractNumId w:val="4"/>
+  <w:num w:numId="15" w16cid:durableId="640160232">
+    <w:abstractNumId w:val="1"/>
   </w:num>
-  <w:num w:numId="7" w16cid:durableId="582572779">
+  <w:num w:numId="16" w16cid:durableId="2091464084">
     <w:abstractNumId w:val="2"/>
   </w:num>
-  <w:num w:numId="8" w16cid:durableId="1869222788">
-    <w:abstractNumId w:val="9"/>
+  <w:num w:numId="17" w16cid:durableId="1145588353">
+    <w:abstractNumId w:val="0"/>
   </w:num>
-  <w:num w:numId="9" w16cid:durableId="520969194">
-    <w:abstractNumId w:val="12"/>
-  </w:num>
-  <w:num w:numId="10" w16cid:durableId="150024092">
-    <w:abstractNumId w:val="1"/>
-  </w:num>
-  <w:num w:numId="11" w16cid:durableId="2099323962">
-    <w:abstractNumId w:val="14"/>
-  </w:num>
-  <w:num w:numId="12" w16cid:durableId="1194611696">
-    <w:abstractNumId w:val="7"/>
-  </w:num>
-  <w:num w:numId="13" w16cid:durableId="1968971472">
+  <w:num w:numId="18" w16cid:durableId="1501504541">
     <w:abstractNumId w:val="3"/>
   </w:num>
-  <w:num w:numId="14" w16cid:durableId="509490107">
-    <w:abstractNumId w:val="5"/>
-  </w:num>
-  <w:num w:numId="15" w16cid:durableId="640160232">
-    <w:abstractNumId w:val="0"/>
+  <w:num w:numId="19" w16cid:durableId="1313683488">
+    <w:abstractNumId w:val="8"/>
   </w:num>
 </w:numbering>
 </file>
@@ -9914,6 +10442,22 @@
       <w:spacing w:val="5"/>
     </w:rPr>
   </w:style>
+  <w:style w:type="paragraph" w:styleId="NormalWeb">
+    <w:name w:val="Normal (Web)"/>
+    <w:basedOn w:val="Normal"/>
+    <w:uiPriority w:val="99"/>
+    <w:unhideWhenUsed/>
+    <w:rsid w:val="00FD7B14"/>
+    <w:pPr>
+      <w:spacing w:before="100" w:beforeAutospacing="1" w:after="100" w:afterAutospacing="1" w:line="240" w:lineRule="auto"/>
+    </w:pPr>
+    <w:rPr>
+      <w:rFonts w:ascii="Times New Roman" w:eastAsia="Times New Roman" w:hAnsi="Times New Roman" w:cs="Times New Roman"/>
+      <w:sz w:val="24"/>
+      <w:szCs w:val="24"/>
+      <w:lang w:val="en-US"/>
+    </w:rPr>
+  </w:style>
 </w:styles>
 </file>
 

</xml_diff>